<commit_message>
feat: universal AI PM portfolio with curated top-2 peer projects and cross-company collaboration
</commit_message>
<xml_diff>
--- a/01_Портфолио_и_Проекты/Портфолио_Лаврентий_Ямпуров_AI_PM.docx
+++ b/01_Портфолио_и_Проекты/Портфолио_Лаврентий_Ямпуров_AI_PM.docx
@@ -2,6 +2,19 @@
 <file path=word/document.xml><?xml version="1.0" encoding="utf-8"?>
 <w:document xmlns:wpc="http://schemas.microsoft.com/office/word/2010/wordprocessingCanvas" xmlns:mo="http://schemas.microsoft.com/office/mac/office/2008/main" xmlns:mc="http://schemas.openxmlformats.org/markup-compatibility/2006" xmlns:mv="urn:schemas-microsoft-com:mac:vml" xmlns:o="urn:schemas-microsoft-com:office:office" xmlns:r="http://schemas.openxmlformats.org/officeDocument/2006/relationships" xmlns:m="http://schemas.openxmlformats.org/officeDocument/2006/math" xmlns:v="urn:schemas-microsoft-com:vml" xmlns:wp14="http://schemas.microsoft.com/office/word/2010/wordprocessingDrawing" xmlns:wp="http://schemas.openxmlformats.org/drawingml/2006/wordprocessingDrawing" xmlns:w10="urn:schemas-microsoft-com:office:word" xmlns:w="http://schemas.openxmlformats.org/wordprocessingml/2006/main" xmlns:w14="http://schemas.microsoft.com/office/word/2010/wordml" xmlns:wpg="http://schemas.microsoft.com/office/word/2010/wordprocessingGroup" xmlns:wpi="http://schemas.microsoft.com/office/word/2010/wordprocessingInk" xmlns:wne="http://schemas.microsoft.com/office/word/2006/wordml" xmlns:wps="http://schemas.microsoft.com/office/word/2010/wordprocessingShape" mc:Ignorable="w14 wp14">
   <w:body>
+    <w:p>
+      <w:pPr>
+        <w:spacing w:after="20"/>
+      </w:pPr>
+      <w:r>
+        <w:rPr>
+          <w:b/>
+          <w:color w:val="0072CE"/>
+          <w:sz w:val="21"/>
+        </w:rPr>
+        <w:t>ПОРТФОЛИО ПРОЕКТОВ И ПРИКЛАДНЫХ ИИ-РЕШЕНИЙ</w:t>
+      </w:r>
+    </w:p>
     <w:p>
       <w:pPr>
         <w:spacing w:after="40"/>
@@ -9,21 +22,8 @@
       <w:r>
         <w:rPr>
           <w:b/>
-          <w:color w:val="0072CE"/>
-          <w:sz w:val="22"/>
-        </w:rPr>
-        <w:t>ПОРТФОЛИО ПРОЕКТОВ И ПРИКЛАДНЫХ РЕШЕНИЙ</w:t>
-      </w:r>
-    </w:p>
-    <w:p>
-      <w:pPr>
-        <w:spacing w:after="60"/>
-      </w:pPr>
-      <w:r>
-        <w:rPr>
-          <w:b/>
           <w:color w:val="003366"/>
-          <w:sz w:val="44"/>
+          <w:sz w:val="40"/>
         </w:rPr>
         <w:t>Лаврентий Ямпуров</w:t>
         <w:br/>
@@ -32,17 +32,17 @@
         <w:rPr>
           <w:b/>
           <w:color w:val="0072CE"/>
-          <w:sz w:val="26"/>
+          <w:sz w:val="24"/>
         </w:rPr>
-        <w:t>AI Solutions Architect • Technical PM • Системный инженер</w:t>
+        <w:t>AI Product Manager • AI Solutions Architect • Lead Systems Analyst</w:t>
       </w:r>
     </w:p>
     <w:p>
       <w:pPr>
-        <w:spacing w:after="160"/>
+        <w:spacing w:after="120"/>
       </w:pPr>
       <w:r>
-        <w:t>Специализация: Мультиагентные системы (Multi-Agent Systems) • Industrial AI в ТЭК • Автоматизация стратегий</w:t>
+        <w:t>Специализация: Мультиагентные системы (Multi-Agent Systems) • Industrial AI &amp; MLOps • Корпоративная аналитика • Product Delivery</w:t>
         <w:br/>
       </w:r>
       <w:r>
@@ -57,49 +57,53 @@
         <w:tblLook w:firstColumn="1" w:firstRow="1" w:lastColumn="0" w:lastRow="0" w:noHBand="0" w:noVBand="1" w:val="04A0"/>
       </w:tblPr>
       <w:tblGrid>
-        <w:gridCol w:w="10080"/>
+        <w:gridCol w:w="10224"/>
       </w:tblGrid>
       <w:tr>
         <w:tc>
           <w:tcPr>
             <w:tcW w:type="dxa" w:w="9792"/>
-            <w:shd w:val="clear" w:color="auto" w:fill="F0F7FF"/>
+            <w:shd w:fill="F0F4F8"/>
             <w:tcMar>
-              <w:top w:w="120" w:type="dxa"/>
-              <w:bottom w:w="120" w:type="dxa"/>
-              <w:left w:w="180" w:type="dxa"/>
-              <w:right w:w="180" w:type="dxa"/>
+              <w:top w:w="100" w:type="dxa"/>
+              <w:bottom w:w="100" w:type="dxa"/>
+              <w:left w:w="150" w:type="dxa"/>
+              <w:right w:w="150" w:type="dxa"/>
             </w:tcMar>
             <w:tcBorders>
               <w:left w:val="single" w:sz="24" w:space="0" w:color="0072CE"/>
+              <w:top w:val="none"/>
+              <w:right w:val="none"/>
+              <w:bottom w:val="none"/>
             </w:tcBorders>
           </w:tcPr>
           <w:p>
             <w:pPr>
-              <w:spacing w:before="0" w:after="80"/>
+              <w:spacing w:after="60" w:line="276" w:lineRule="auto"/>
             </w:pPr>
             <w:r>
               <w:rPr>
                 <w:b/>
-                <w:color w:val="004C87"/>
-                <w:sz w:val="22"/>
+                <w:color w:val="003366"/>
+                <w:sz w:val="20"/>
               </w:rPr>
-              <w:t>КЛЮЧЕВОЙ ПРОФИЛЬ И СИНЕРГИЯ КОМПЕТЕНЦИЙ</w:t>
+              <w:t>★ ПРОФИЛЬНЫЙ ФОКУС И ЦЕННОСТНОЕ ПРЕДЛОЖЕНИЕ</w:t>
+              <w:br/>
             </w:r>
-          </w:p>
-          <w:p>
-            <w:pPr>
-              <w:spacing w:before="40" w:after="40" w:line="276" w:lineRule="auto"/>
-            </w:pPr>
             <w:r>
               <w:rPr>
                 <w:color w:val="333333"/>
-                <w:sz w:val="19"/>
+                <w:sz w:val="18"/>
               </w:rPr>
-              <w:t>Специалист редкого гибридного профиля: сочетаю глубокое практическое понимание архитектуры прикладных ИИ-систем (LangGraph, Pydantic v2, Advanced RAG, On-Premise инференс, python-pptx) с подтвержденным опытом управления цифровой трансформацией в тяжелой промышленности (ВГК) и сильной академической базой в области стратегии (Магистратура НИУ ИТМО по инноватике и стратегиям бизнес-трансформации).</w:t>
+              <w:t>Специалист редкого гибридного профиля на стыке архитектуры ИИ-систем, системной инженерии и продуктового управления:</w:t>
               <w:br/>
+              <w:t>• Архитектура современных ИИ-систем: практический опыт проектирования мультиагентных конвейеров (LangGraph StateGraph, Pydantic v2 data contracts, Model Context Protocol FastMCP, Advanced RAG с гибридным поиском и реранкингом, On-Premise инференс vLLM/Ollama, программная генерация презентаций и отчетов).</w:t>
               <w:br/>
-              <w:t>Формат реализации представленных проектов: разработаны мной лично (end-to-end), либо в рамках научно-прикладных R&amp;D-команд (в партнерстве с инженерами ИТМО / отраслевыми разработчиками) в роли System Architect / Technical PM / Co-Developer. Моя зона ответственности: постановка ТЗ, проектирование контрактов данных, связывание ML-моделей в сквозные конвейеры, валидация и бизнес-эффект.</w:t>
+              <w:t>• Отраслевая экспертиза в тяжелой индустрии: реальный опыт руководства цифровой трансформацией в горнорудной отрасли (Восточная горнорудная компания: агент дефектовки оборудования ТОиР с интеграцией в 1C:ERP, предиктивный контур раннего предупреждения отказов карьерной техники).</w:t>
+              <w:br/>
+              <w:t>• Академический стратегический фундамент: Магистратура НИУ ИТМО (Факультет технологий менеджмента и инноваций) по направлению «Технологии и стратегии бизнес-трансформации, Инноватика».</w:t>
+              <w:br/>
+              <w:t>• Формат реализации представленных проектов: разработаны мной лично (end-to-end от идеи и архитектуры до кода), либо в проектных кросс-функциональных командах в партнерстве со специалистами из других компаний и смежных отделов в роли AI Solutions Architect / Technical PM / Co-Developer. Моя зона ответственности: декомпозиция бизнес-целей в инженерные ТЗ, контракты данных, связывание ML/LLM-моделей в сквозные пайплайны, контроль метрик качества и интеграция в бизнес-процессы.</w:t>
             </w:r>
           </w:p>
         </w:tc>
@@ -107,15 +111,20 @@
     </w:tbl>
     <w:p>
       <w:pPr>
-        <w:spacing w:before="160" w:after="80"/>
+        <w:spacing w:after="40"/>
+      </w:pPr>
+    </w:p>
+    <w:p>
+      <w:pPr>
+        <w:spacing w:before="120" w:after="60"/>
       </w:pPr>
       <w:r>
         <w:rPr>
           <w:b/>
           <w:color w:val="003366"/>
-          <w:sz w:val="25"/>
+          <w:sz w:val="23"/>
         </w:rPr>
-        <w:t>1. Ключевые компетенции и стек технологий</w:t>
+        <w:t>1. Ключевые компетенции и технологический стек</w:t>
       </w:r>
     </w:p>
     <w:tbl>
@@ -126,19 +135,19 @@
         <w:tblLook w:firstColumn="1" w:firstRow="1" w:lastColumn="0" w:lastRow="0" w:noHBand="0" w:noVBand="1" w:val="04A0"/>
       </w:tblPr>
       <w:tblGrid>
-        <w:gridCol w:w="5040"/>
-        <w:gridCol w:w="5040"/>
+        <w:gridCol w:w="5112"/>
+        <w:gridCol w:w="5112"/>
       </w:tblGrid>
       <w:tr>
         <w:tc>
           <w:tcPr>
             <w:tcW w:type="dxa" w:w="3168"/>
-            <w:shd w:val="clear" w:color="auto" w:fill="003366"/>
+            <w:shd w:fill="003366"/>
             <w:tcMar>
-              <w:top w:w="70" w:type="dxa"/>
-              <w:bottom w:w="70" w:type="dxa"/>
-              <w:left w:w="120" w:type="dxa"/>
-              <w:right w:w="120" w:type="dxa"/>
+              <w:top w:w="60" w:type="dxa"/>
+              <w:bottom w:w="60" w:type="dxa"/>
+              <w:left w:w="100" w:type="dxa"/>
+              <w:right w:w="100" w:type="dxa"/>
             </w:tcMar>
           </w:tcPr>
           <w:p>
@@ -146,7 +155,7 @@
               <w:rPr>
                 <w:b/>
                 <w:color w:val="FFFFFF"/>
-                <w:sz w:val="18"/>
+                <w:sz w:val="17"/>
               </w:rPr>
               <w:t>Функциональная область</w:t>
             </w:r>
@@ -155,12 +164,12 @@
         <w:tc>
           <w:tcPr>
             <w:tcW w:type="dxa" w:w="6624"/>
-            <w:shd w:val="clear" w:color="auto" w:fill="003366"/>
+            <w:shd w:fill="003366"/>
             <w:tcMar>
-              <w:top w:w="70" w:type="dxa"/>
-              <w:bottom w:w="70" w:type="dxa"/>
-              <w:left w:w="120" w:type="dxa"/>
-              <w:right w:w="120" w:type="dxa"/>
+              <w:top w:w="60" w:type="dxa"/>
+              <w:bottom w:w="60" w:type="dxa"/>
+              <w:left w:w="100" w:type="dxa"/>
+              <w:right w:w="100" w:type="dxa"/>
             </w:tcMar>
           </w:tcPr>
           <w:p>
@@ -168,9 +177,9 @@
               <w:rPr>
                 <w:b/>
                 <w:color w:val="FFFFFF"/>
-                <w:sz w:val="18"/>
+                <w:sz w:val="17"/>
               </w:rPr>
-              <w:t>Инструменты, стек и методологии</w:t>
+              <w:t>Инструменты, технологии и методологии</w:t>
             </w:r>
           </w:p>
         </w:tc>
@@ -179,41 +188,41 @@
         <w:tc>
           <w:tcPr>
             <w:tcW w:type="dxa" w:w="3168"/>
-            <w:shd w:val="clear" w:color="auto" w:fill="F8FAFC"/>
+            <w:shd w:fill="F8FAFC"/>
             <w:tcMar>
-              <w:top w:w="60" w:type="dxa"/>
-              <w:bottom w:w="60" w:type="dxa"/>
-              <w:left w:w="120" w:type="dxa"/>
-              <w:right w:w="120" w:type="dxa"/>
+              <w:top w:w="50" w:type="dxa"/>
+              <w:bottom w:w="50" w:type="dxa"/>
+              <w:left w:w="100" w:type="dxa"/>
+              <w:right w:w="100" w:type="dxa"/>
             </w:tcMar>
           </w:tcPr>
           <w:p>
             <w:r>
               <w:rPr>
                 <w:b/>
-                <w:sz w:val="17"/>
+                <w:sz w:val="16"/>
               </w:rPr>
-              <w:t>ИИ, Агенты и LLM</w:t>
+              <w:t>Мультиагентные системы и LLM</w:t>
             </w:r>
           </w:p>
         </w:tc>
         <w:tc>
           <w:tcPr>
             <w:tcW w:type="dxa" w:w="6624"/>
-            <w:shd w:val="clear" w:color="auto" w:fill="F8FAFC"/>
+            <w:shd w:fill="F8FAFC"/>
             <w:tcMar>
-              <w:top w:w="60" w:type="dxa"/>
-              <w:bottom w:w="60" w:type="dxa"/>
-              <w:left w:w="120" w:type="dxa"/>
-              <w:right w:w="120" w:type="dxa"/>
+              <w:top w:w="50" w:type="dxa"/>
+              <w:bottom w:w="50" w:type="dxa"/>
+              <w:left w:w="100" w:type="dxa"/>
+              <w:right w:w="100" w:type="dxa"/>
             </w:tcMar>
           </w:tcPr>
           <w:p>
             <w:r>
               <w:rPr>
-                <w:sz w:val="17"/>
+                <w:sz w:val="16"/>
               </w:rPr>
-              <w:t>Multi-Agent Pipelines, LangGraph (StateGraph), Pydantic v2 (instructor), FastMCP, Prompt Engineering, Stanford DSPy, LoRA/QLoRA (готовность), On-Premise vLLM / Ollama.</w:t>
+              <w:t>Multi-Agent Pipelines, LangGraph (StateGraph), Pydantic v2, FastMCP (Anthropic Model Context Protocol), Evaluator-Optimizer (Reflexion), Prompt Engineering, On-Premise vLLM / Ollama.</w:t>
             </w:r>
           </w:p>
         </w:tc>
@@ -222,19 +231,19 @@
         <w:tc>
           <w:tcPr>
             <w:tcW w:type="dxa" w:w="3168"/>
-            <w:shd w:val="clear" w:color="auto" w:fill="FFFFFF"/>
+            <w:shd w:fill="FFFFFF"/>
             <w:tcMar>
-              <w:top w:w="60" w:type="dxa"/>
-              <w:bottom w:w="60" w:type="dxa"/>
-              <w:left w:w="120" w:type="dxa"/>
-              <w:right w:w="120" w:type="dxa"/>
+              <w:top w:w="50" w:type="dxa"/>
+              <w:bottom w:w="50" w:type="dxa"/>
+              <w:left w:w="100" w:type="dxa"/>
+              <w:right w:w="100" w:type="dxa"/>
             </w:tcMar>
           </w:tcPr>
           <w:p>
             <w:r>
               <w:rPr>
                 <w:b/>
-                <w:sz w:val="17"/>
+                <w:sz w:val="16"/>
               </w:rPr>
               <w:t>Advanced RAG и Поиск</w:t>
             </w:r>
@@ -243,20 +252,20 @@
         <w:tc>
           <w:tcPr>
             <w:tcW w:type="dxa" w:w="6624"/>
-            <w:shd w:val="clear" w:color="auto" w:fill="FFFFFF"/>
+            <w:shd w:fill="FFFFFF"/>
             <w:tcMar>
-              <w:top w:w="60" w:type="dxa"/>
-              <w:bottom w:w="60" w:type="dxa"/>
-              <w:left w:w="120" w:type="dxa"/>
-              <w:right w:w="120" w:type="dxa"/>
+              <w:top w:w="50" w:type="dxa"/>
+              <w:bottom w:w="50" w:type="dxa"/>
+              <w:left w:w="100" w:type="dxa"/>
+              <w:right w:w="100" w:type="dxa"/>
             </w:tcMar>
           </w:tcPr>
           <w:p>
             <w:r>
               <w:rPr>
-                <w:sz w:val="17"/>
+                <w:sz w:val="16"/>
               </w:rPr>
-              <w:t>Гибридный поиск (Dense bge-m3 + Sparse BM25 + RRF), кросс-энкодерный реранкинг (bge-reranker-large), Layout-парсеры (Docling, Marker), векторные базы Qdrant / Chroma.</w:t>
+              <w:t>Гибридный поиск (Dense bge-m3 + Sparse BM25 + RRF), кросс-энкодерный реранкинг (bge-reranker-large), Layout-парсеры (Docling, Marker), векторные базы Qdrant / Chroma, метрики Ragas.</w:t>
             </w:r>
           </w:p>
         </w:tc>
@@ -265,41 +274,41 @@
         <w:tc>
           <w:tcPr>
             <w:tcW w:type="dxa" w:w="3168"/>
-            <w:shd w:val="clear" w:color="auto" w:fill="F8FAFC"/>
+            <w:shd w:fill="F8FAFC"/>
             <w:tcMar>
-              <w:top w:w="60" w:type="dxa"/>
-              <w:bottom w:w="60" w:type="dxa"/>
-              <w:left w:w="120" w:type="dxa"/>
-              <w:right w:w="120" w:type="dxa"/>
+              <w:top w:w="50" w:type="dxa"/>
+              <w:bottom w:w="50" w:type="dxa"/>
+              <w:left w:w="100" w:type="dxa"/>
+              <w:right w:w="100" w:type="dxa"/>
             </w:tcMar>
           </w:tcPr>
           <w:p>
             <w:r>
               <w:rPr>
                 <w:b/>
-                <w:sz w:val="17"/>
+                <w:sz w:val="16"/>
               </w:rPr>
-              <w:t>Разработка и Автоматизация</w:t>
+              <w:t>Индустриальный ML и Big Data</w:t>
             </w:r>
           </w:p>
         </w:tc>
         <w:tc>
           <w:tcPr>
             <w:tcW w:type="dxa" w:w="6624"/>
-            <w:shd w:val="clear" w:color="auto" w:fill="F8FAFC"/>
+            <w:shd w:fill="F8FAFC"/>
             <w:tcMar>
-              <w:top w:w="60" w:type="dxa"/>
-              <w:bottom w:w="60" w:type="dxa"/>
-              <w:left w:w="120" w:type="dxa"/>
-              <w:right w:w="120" w:type="dxa"/>
+              <w:top w:w="50" w:type="dxa"/>
+              <w:bottom w:w="50" w:type="dxa"/>
+              <w:left w:w="100" w:type="dxa"/>
+              <w:right w:w="100" w:type="dxa"/>
             </w:tcMar>
           </w:tcPr>
           <w:p>
             <w:r>
               <w:rPr>
-                <w:sz w:val="17"/>
+                <w:sz w:val="16"/>
               </w:rPr>
-              <w:t>Python 3.9+, python-pptx (программная верстка презентаций), python-docx (генерация отчетов), FastAPI, ClickHouse, Docker, REST API, JSON Contracts.</w:t>
+              <w:t>Python 3.9+, Scikit-learn, XGBoost, ClickHouse, Apache Spark streaming logic, MLOps, MLflow, анализ промышленной телеметрии (MWD/LWD датчики бурения, вибродиагностика насосов).</w:t>
             </w:r>
           </w:p>
         </w:tc>
@@ -308,19 +317,19 @@
         <w:tc>
           <w:tcPr>
             <w:tcW w:type="dxa" w:w="3168"/>
-            <w:shd w:val="clear" w:color="auto" w:fill="FFFFFF"/>
+            <w:shd w:fill="FFFFFF"/>
             <w:tcMar>
-              <w:top w:w="60" w:type="dxa"/>
-              <w:bottom w:w="60" w:type="dxa"/>
-              <w:left w:w="120" w:type="dxa"/>
-              <w:right w:w="120" w:type="dxa"/>
+              <w:top w:w="50" w:type="dxa"/>
+              <w:bottom w:w="50" w:type="dxa"/>
+              <w:left w:w="100" w:type="dxa"/>
+              <w:right w:w="100" w:type="dxa"/>
             </w:tcMar>
           </w:tcPr>
           <w:p>
             <w:r>
               <w:rPr>
                 <w:b/>
-                <w:sz w:val="17"/>
+                <w:sz w:val="16"/>
               </w:rPr>
               <w:t>Product &amp; Delivery Management</w:t>
             </w:r>
@@ -329,20 +338,20 @@
         <w:tc>
           <w:tcPr>
             <w:tcW w:type="dxa" w:w="6624"/>
-            <w:shd w:val="clear" w:color="auto" w:fill="FFFFFF"/>
+            <w:shd w:fill="FFFFFF"/>
             <w:tcMar>
-              <w:top w:w="60" w:type="dxa"/>
-              <w:bottom w:w="60" w:type="dxa"/>
-              <w:left w:w="120" w:type="dxa"/>
-              <w:right w:w="120" w:type="dxa"/>
+              <w:top w:w="50" w:type="dxa"/>
+              <w:bottom w:w="50" w:type="dxa"/>
+              <w:left w:w="100" w:type="dxa"/>
+              <w:right w:w="100" w:type="dxa"/>
             </w:tcMar>
           </w:tcPr>
           <w:p>
             <w:r>
               <w:rPr>
-                <w:sz w:val="17"/>
+                <w:sz w:val="16"/>
               </w:rPr>
-              <w:t>Управление требованиями (BRD/FRD, User Stories, BPMN, UML), Agile/Scrumban, оценка рисков (Red Flags), юнит-экономика, стейкхолдер-менеджмент C-level.</w:t>
+              <w:t>Управление требованиями (BRD/FRD, User Stories, BPMN 2.0, UML), Agile/Scrum/Scrumban, аудит контрактов и рисков (Red Flags), юнит-экономика, стейкхолдер-менеджмент C-level.</w:t>
             </w:r>
           </w:p>
         </w:tc>
@@ -350,34 +359,34 @@
     </w:tbl>
     <w:p>
       <w:pPr>
-        <w:spacing w:before="240" w:after="80"/>
+        <w:spacing w:before="200" w:after="60"/>
       </w:pPr>
       <w:r>
         <w:rPr>
           <w:b/>
           <w:color w:val="003366"/>
-          <w:sz w:val="24"/>
+          <w:sz w:val="23"/>
         </w:rPr>
-        <w:t>2. Флагманский целевой проект: Мультиагентный конвейер ДСИиУР (ПАО «Газпром нефть»)</w:t>
+        <w:t>2. Мультиагентные системы и корпоративный GenAI (Enterprise AI Automation)</w:t>
       </w:r>
     </w:p>
     <w:p>
       <w:pPr>
-        <w:spacing w:before="120" w:after="20"/>
+        <w:spacing w:before="100" w:after="20"/>
       </w:pPr>
       <w:r>
         <w:rPr>
           <w:b/>
           <w:color w:val="004C87"/>
-          <w:sz w:val="20"/>
+          <w:sz w:val="19"/>
         </w:rPr>
         <w:t>• Мультиагентная система стратегического анализа и каскадирования инициатив (ДСИиУР)</w:t>
       </w:r>
     </w:p>
     <w:p>
       <w:pPr>
-        <w:spacing w:after="60" w:line="276" w:lineRule="auto"/>
-        <w:ind w:left="288"/>
+        <w:spacing w:after="40" w:line="269" w:lineRule="auto"/>
+        <w:ind w:left="259"/>
       </w:pPr>
       <w:r>
         <w:rPr>
@@ -400,49 +409,36 @@
         <w:br/>
       </w:r>
       <w:r>
-        <w:t>Суть решения: Сквозной конвейер из 3-х агентов для устранения разрыва коммуникации со стратегией подразделений (Бурение, Логистика, ИТ). Агент 1 собирает отраслевые новости без платных API и выявляет ранние угрозы (Early Warnings). Агент 2 синтезирует инициативы и валидирует их в цикле самокритики (Reflexion) по 4 направлениям (Санкции 30%, Окупаемость 30%, TRL 20%, Безопасность 20%) с масштабированием до 1000 критериев (Map-Reduce). Агент 3 адаптирует инициативы под сленг/KPI отделов и собирает презентации по брендбуку.</w:t>
+        <w:t>Суть решения: Сквозной конвейер из 3-х агентов для устранения разрыва коммуникации между корпоративной стратегией и подразделениями (Бурение, Логистика, ИТ). Агент 1 собирает отраслевые сигналы без платных API и формирует ранние предупреждения (Early Warnings). Агент 2 синтезирует инициативы и валидирует их в цикле рефлексии (Reflexion) по критериальной матрице с масштабированием до 1000 критериев (Map-Reduce). Агент 3 адаптирует инициативы под отраслевой сленг подразделений и генерирует презентации по брендбуку.</w:t>
         <w:br/>
       </w:r>
       <w:r>
         <w:rPr>
           <w:b/>
         </w:rPr>
-        <w:t xml:space="preserve">Результат / Артефакты: </w:t>
+        <w:t xml:space="preserve">Результат и артефакты: </w:t>
       </w:r>
       <w:r>
-        <w:t>Работающий прототип конвейера main.py, стратегический питч-дек на 21 слайд (Презентация_ИИ_Агенты_ГазпромНефть.pptx), полный иллюстрированный отчет на 12 глав (1.26 МБ) с дорожной картой на 100 дней и открытый репозиторий на GitHub.</w:t>
+        <w:t>Действующий прототип конвейера run.py, стратегический питч-дек на 21 слайд (Презентация_ИИ_Агенты_ГазпромНефть.pptx), полный иллюстрированный отчет на 12 глав и открытый репозиторий на GitHub.</w:t>
       </w:r>
     </w:p>
     <w:p>
       <w:pPr>
-        <w:spacing w:before="240" w:after="80"/>
-      </w:pPr>
-      <w:r>
-        <w:rPr>
-          <w:b/>
-          <w:color w:val="003366"/>
-          <w:sz w:val="24"/>
-        </w:rPr>
-        <w:t>3. Отраслевой Industrial AI в Нефтегазе и Добывающей промышленности</w:t>
-      </w:r>
-    </w:p>
-    <w:p>
-      <w:pPr>
-        <w:spacing w:before="120" w:after="20"/>
+        <w:spacing w:before="100" w:after="20"/>
       </w:pPr>
       <w:r>
         <w:rPr>
           <w:b/>
           <w:color w:val="004C87"/>
-          <w:sz w:val="20"/>
+          <w:sz w:val="19"/>
         </w:rPr>
-        <w:t>• Цифровая трансформация ТОиР и контур раннего предупреждения (Восточная горнорудная компания)</w:t>
+        <w:t>• Multi-Agent Judge: Двухагентный контур самокритики и арбитража решений (Evaluator-Optimizer)</w:t>
       </w:r>
     </w:p>
     <w:p>
       <w:pPr>
-        <w:spacing w:after="60" w:line="276" w:lineRule="auto"/>
-        <w:ind w:left="288"/>
+        <w:spacing w:after="40" w:line="269" w:lineRule="auto"/>
+        <w:ind w:left="259"/>
       </w:pPr>
       <w:r>
         <w:rPr>
@@ -451,7 +447,7 @@
         <w:t xml:space="preserve">Роль: </w:t>
       </w:r>
       <w:r>
-        <w:t>Руководитель проектов цифровой трансформации (личное внедрение в производство)</w:t>
+        <w:t>AI Solutions Architect (в партнерстве со специалистами из технологических компаний)</w:t>
         <w:br/>
       </w:r>
       <w:r>
@@ -461,7 +457,124 @@
         <w:t xml:space="preserve">Стек: </w:t>
       </w:r>
       <w:r>
-        <w:t>Python, 1C:Enterprise API, RAG по базе знаний, телеметрия оборудования, BPMN.</w:t>
+        <w:t>Python, Multi-Agent Architecture, Anthropic Building Effective Agents, LLM-as-a-Judge, Ragas.</w:t>
+        <w:br/>
+      </w:r>
+      <w:r>
+        <w:t>Суть решения: Архитектурный контур из 4-х агентов: Генератор решения -&gt; Тестировщик дефектов -&gt; Оптимизатор -&gt; Независимая Модель-Судья (Judge). Судья выставляет объективный скоринг (0-10) и при непрохождении порога возвращает задачу на доработку с замечаниями. Полностью детерминированный цикл рефлексии (Reflexion), гарантирующий исключение галлюцинаций до публикации артефактов.</w:t>
+        <w:br/>
+      </w:r>
+      <w:r>
+        <w:rPr>
+          <w:b/>
+        </w:rPr>
+        <w:t xml:space="preserve">Результат и артефакты: </w:t>
+      </w:r>
+      <w:r>
+        <w:t>Действующий модуль agent_evaluator_optimizer.py, 100% покрытие автотестами, детерминированная критериальная матрица.</w:t>
+      </w:r>
+    </w:p>
+    <w:p>
+      <w:pPr>
+        <w:spacing w:before="100" w:after="20"/>
+      </w:pPr>
+      <w:r>
+        <w:rPr>
+          <w:b/>
+          <w:color w:val="004C87"/>
+          <w:sz w:val="19"/>
+        </w:rPr>
+        <w:t>• OilGas FastMCP Server: Высокопроизводительный сервер контекста по нормативной базе ТЭК</w:t>
+      </w:r>
+    </w:p>
+    <w:p>
+      <w:pPr>
+        <w:spacing w:after="40" w:line="269" w:lineRule="auto"/>
+        <w:ind w:left="259"/>
+      </w:pPr>
+      <w:r>
+        <w:rPr>
+          <w:b/>
+        </w:rPr>
+        <w:t xml:space="preserve">Роль: </w:t>
+      </w:r>
+      <w:r>
+        <w:t>Architect / Developer (в партнерстве со специалистами по инфраструктуре ИИ)</w:t>
+        <w:br/>
+      </w:r>
+      <w:r>
+        <w:rPr>
+          <w:b/>
+        </w:rPr>
+        <w:t xml:space="preserve">Стек: </w:t>
+      </w:r>
+      <w:r>
+        <w:t>Python 3.13, FastMCP (Anthropic Model Context Protocol), Qdrant Vector DB, Sentence-Transformers.</w:t>
+        <w:br/>
+      </w:r>
+      <w:r>
+        <w:t>Суть решения: Разработка сервера контекста новейшего стандарта Anthropic MCP для интеграции LLM-агентов с нормативной базой (ГОСТ Р 53711, СТО, ФНП № 534). Позволяет любому внешнему агенту через stdio и стандартизированный JSON-RPC безопасно извлекать точные нормативные требования с миллисекундным откликом.</w:t>
+        <w:br/>
+      </w:r>
+      <w:r>
+        <w:rPr>
+          <w:b/>
+        </w:rPr>
+        <w:t xml:space="preserve">Результат и артефакты: </w:t>
+      </w:r>
+      <w:r>
+        <w:t>Действующий MCP-сервер с инструментами семантического поиска и верификации стандартов. Тестовый скрипт test_oilgas_mcp.py.</w:t>
+      </w:r>
+    </w:p>
+    <w:p>
+      <w:pPr>
+        <w:spacing w:before="200" w:after="60"/>
+      </w:pPr>
+      <w:r>
+        <w:rPr>
+          <w:b/>
+          <w:color w:val="003366"/>
+          <w:sz w:val="23"/>
+        </w:rPr>
+        <w:t>3. Industrial AI, промышленная телеметрия и MLOps (ТЭК и Тяжелая индустрия)</w:t>
+      </w:r>
+    </w:p>
+    <w:p>
+      <w:pPr>
+        <w:spacing w:before="100" w:after="20"/>
+      </w:pPr>
+      <w:r>
+        <w:rPr>
+          <w:b/>
+          <w:color w:val="004C87"/>
+          <w:sz w:val="19"/>
+        </w:rPr>
+        <w:t>• Цифровая трансформация ТОиР и контур раннего предупреждения (Восточная горнорудная компания)</w:t>
+      </w:r>
+    </w:p>
+    <w:p>
+      <w:pPr>
+        <w:spacing w:after="40" w:line="269" w:lineRule="auto"/>
+        <w:ind w:left="259"/>
+      </w:pPr>
+      <w:r>
+        <w:rPr>
+          <w:b/>
+        </w:rPr>
+        <w:t xml:space="preserve">Роль: </w:t>
+      </w:r>
+      <w:r>
+        <w:t>Руководитель проектов цифровой трансформации (производственное внедрение)</w:t>
+        <w:br/>
+      </w:r>
+      <w:r>
+        <w:rPr>
+          <w:b/>
+        </w:rPr>
+        <w:t xml:space="preserve">Стек: </w:t>
+      </w:r>
+      <w:r>
+        <w:t>Python, 1C:Enterprise API, RAG по базе знаний ТОиР, телеметрия оборудования, BPMN 2.0.</w:t>
         <w:br/>
       </w:r>
       <w:r>
@@ -472,29 +585,29 @@
         <w:rPr>
           <w:b/>
         </w:rPr>
-        <w:t xml:space="preserve">Результат / Артефакты: </w:t>
+        <w:t xml:space="preserve">Результат и артефакты: </w:t>
       </w:r>
       <w:r>
-        <w:t>Действующий производственный контур, сокращение времени регистрации инцидентов ТОиР, предиктивный мониторинг отказов.</w:t>
+        <w:t>Действующий производственный контур, сокращение времени регистрации инцидентов ТОиР, система предиктивного мониторинга отказов техники.</w:t>
       </w:r>
     </w:p>
     <w:p>
       <w:pPr>
-        <w:spacing w:before="120" w:after="20"/>
+        <w:spacing w:before="100" w:after="20"/>
       </w:pPr>
       <w:r>
         <w:rPr>
           <w:b/>
           <w:color w:val="004C87"/>
-          <w:sz w:val="20"/>
+          <w:sz w:val="19"/>
         </w:rPr>
         <w:t>• DrillSense: Предиктивное прогнозирование механической скорости бурения ROP (Нефтегаз)</w:t>
       </w:r>
     </w:p>
     <w:p>
       <w:pPr>
-        <w:spacing w:after="60" w:line="276" w:lineRule="auto"/>
-        <w:ind w:left="288"/>
+        <w:spacing w:after="40" w:line="269" w:lineRule="auto"/>
+        <w:ind w:left="259"/>
       </w:pPr>
       <w:r>
         <w:rPr>
@@ -503,7 +616,7 @@
         <w:t xml:space="preserve">Роль: </w:t>
       </w:r>
       <w:r>
-        <w:t>System Architect / Co-Developer (в связке с ML-инженером)</w:t>
+        <w:t>System Architect / Co-Developer (в партнерстве со специалистами отраслевых отделов)</w:t>
         <w:br/>
       </w:r>
       <w:r>
@@ -513,40 +626,40 @@
         <w:t xml:space="preserve">Стек: </w:t>
       </w:r>
       <w:r>
-        <w:t>Python, Scikit-learn, Random Forest, телеметрия MWD/LWD (Equinor Volve Data Village, скважина 15/9-F-9 A).</w:t>
+        <w:t>Python, Scikit-learn, Random Forest, промысловая телеметрия MWD/LWD (Equinor Volve, скважина 15/9-F-9 A).</w:t>
         <w:br/>
       </w:r>
       <w:r>
-        <w:t>Суть решения: Прогнозирование скорости проходки ROP в реальном времени по 5 датчикам (нагрузка на долото WOB, обороты RPM, подача насосов, крутящий момент). Автоматическое определение аномальных режимов бурения и предупреждение прихвата инструмента.</w:t>
+        <w:t>Суть решения: Прогнозирование скорости проходки ROP в реальном времени по 5 датчикам забойной телеметрии (нагрузка на долото WOB, обороты ротора RPM, подача насосов Flow Rate, крутящий момент Torque). Автоматическое выявление аномальных технологических режимов и предупреждение рисков прихвата бурового инструмента.</w:t>
         <w:br/>
       </w:r>
       <w:r>
         <w:rPr>
           <w:b/>
         </w:rPr>
-        <w:t xml:space="preserve">Результат / Артефакты: </w:t>
+        <w:t xml:space="preserve">Результат и артефакты: </w:t>
       </w:r>
       <w:r>
-        <w:t>Точность модели R2 = 0.892, MAE = 2.41 м/ч на реальных промысловых данных Северного моря. Модуль quick_predict_demo.py.</w:t>
+        <w:t>Точность модели R2 = 0.892, MAE = 2.41 м/ч на промысловых данных Северного моря. Автономный модуль quick_predict_demo.py.</w:t>
       </w:r>
     </w:p>
     <w:p>
       <w:pPr>
-        <w:spacing w:before="120" w:after="20"/>
+        <w:spacing w:before="100" w:after="20"/>
       </w:pPr>
       <w:r>
         <w:rPr>
           <w:b/>
           <w:color w:val="004C87"/>
-          <w:sz w:val="20"/>
+          <w:sz w:val="19"/>
         </w:rPr>
         <w:t>• PumpGuard: IoT MLOps конвейер предиктивного скоринга отказов погружных насосов УЭЦН</w:t>
       </w:r>
     </w:p>
     <w:p>
       <w:pPr>
-        <w:spacing w:after="60" w:line="276" w:lineRule="auto"/>
-        <w:ind w:left="288"/>
+        <w:spacing w:after="40" w:line="269" w:lineRule="auto"/>
+        <w:ind w:left="259"/>
       </w:pPr>
       <w:r>
         <w:rPr>
@@ -555,7 +668,7 @@
         <w:t xml:space="preserve">Роль: </w:t>
       </w:r>
       <w:r>
-        <w:t>Technical Lead / Architect (совместная R&amp;D разработка)</w:t>
+        <w:t>Technical Lead / Architect (в партнерстве со специалистами по Big Data и MLOps)</w:t>
         <w:br/>
       </w:r>
       <w:r>
@@ -565,40 +678,53 @@
         <w:t xml:space="preserve">Стек: </w:t>
       </w:r>
       <w:r>
-        <w:t>Python, ClickHouse, Apache Spark streaming logic, физическая модель деградации ПЭД.</w:t>
+        <w:t>Python, ClickHouse, Apache Spark streaming logic, физическая модель деградации ПЭД, MLflow.</w:t>
         <w:br/>
       </w:r>
       <w:r>
-        <w:t>Суть решения: Предиктивная вибродиагностика и тепловой мониторинг фонда из 500 погружных электроцентробежных насосов. Расчет индекса риска отказа (0-100) за 72 часа до аварии на основе трендов вибрации по осям X/Y/Z и температуры обмоток.</w:t>
+        <w:t>Суть решения: Предиктивная вибродиагностика и тепловой мониторинг фонда из 500 погружных электроцентробежных насосов. Расчет динамического индекса риска отказа (0-100) за 72 часа до инцидента на основе трендов вибрации по осям X/Y/Z и температуры обмоток.</w:t>
         <w:br/>
       </w:r>
       <w:r>
         <w:rPr>
           <w:b/>
         </w:rPr>
-        <w:t xml:space="preserve">Результат / Артефакты: </w:t>
+        <w:t xml:space="preserve">Результат и артефакты: </w:t>
       </w:r>
       <w:r>
-        <w:t>Обработка потока до 5000 замеров/сек, предотвращение дорогостоящего подземного ремонта скважин (ПРС). Модуль quick_score_demo.py.</w:t>
+        <w:t>Обработка потока до 5 000 замеров/сек, предотвращение аварийного подземного ремонта скважин (ПРС). Модуль quick_score_demo.py.</w:t>
       </w:r>
     </w:p>
     <w:p>
       <w:pPr>
-        <w:spacing w:before="120" w:after="20"/>
+        <w:spacing w:before="200" w:after="60"/>
+      </w:pPr>
+      <w:r>
+        <w:rPr>
+          <w:b/>
+          <w:color w:val="003366"/>
+          <w:sz w:val="23"/>
+        </w:rPr>
+        <w:t>4. FinTech, LegalTech и системы принятия решений (Decision Engines)</w:t>
+      </w:r>
+    </w:p>
+    <w:p>
+      <w:pPr>
+        <w:spacing w:before="100" w:after="20"/>
       </w:pPr>
       <w:r>
         <w:rPr>
           <w:b/>
           <w:color w:val="004C87"/>
-          <w:sz w:val="20"/>
+          <w:sz w:val="19"/>
         </w:rPr>
-        <w:t>• CoreVision: Сегментация микрошлифов керна и петрофизический анализ пористости</w:t>
+        <w:t>• Экспресс-аудит коммерческих договоров B2B и скоринг юридических рисков</w:t>
       </w:r>
     </w:p>
     <w:p>
       <w:pPr>
-        <w:spacing w:after="60" w:line="276" w:lineRule="auto"/>
-        <w:ind w:left="288"/>
+        <w:spacing w:after="40" w:line="269" w:lineRule="auto"/>
+        <w:ind w:left="259"/>
       </w:pPr>
       <w:r>
         <w:rPr>
@@ -607,7 +733,7 @@
         <w:t xml:space="preserve">Роль: </w:t>
       </w:r>
       <w:r>
-        <w:t>Product Owner / System Architect (в партнерстве с CV-инженером)</w:t>
+        <w:t>Автор решения / Developer</w:t>
         <w:br/>
       </w:r>
       <w:r>
@@ -617,40 +743,40 @@
         <w:t xml:space="preserve">Стек: </w:t>
       </w:r>
       <w:r>
-        <w:t>Python, OpenCV, U-Net / ResNet architecture, FastAPI, геолого-петрографические данные USGS.</w:t>
+        <w:t>Python 3.9+, Pydantic v2, Decision Engine, стоп-факторы Red Flags, автогенерация протоколов.</w:t>
         <w:br/>
       </w:r>
       <w:r>
-        <w:t>Суть решения: Автоматический микроструктурный анализ шлифов керна: сегментация порового пространства, разделение открытой и закрытой пористости, детекция микротрещин. Ускорение петрофизического описания керна геологом с 90 минут до 2 секунд.</w:t>
+        <w:t>Суть решения: Автоматический аудит коммерческих договоров поставки и подряда: детекция кабальных условий (отсрочка платежа &gt;90 дней, односторонняя пеня &gt;0.1%/день, отсутствие форс-мажора), расчет скоринга надежности контракта (0-100) и автоматическая генерация официального протокола разногласий.</w:t>
         <w:br/>
       </w:r>
       <w:r>
         <w:rPr>
           <w:b/>
         </w:rPr>
-        <w:t xml:space="preserve">Результат / Артефакты: </w:t>
+        <w:t xml:space="preserve">Результат и артефакты: </w:t>
       </w:r>
       <w:r>
-        <w:t>Интерактивный API-сервис, расчет эффективной пористости с погрешностью менее 3.8%. Модуль quick_segment_demo.py.</w:t>
+        <w:t>Работающий скрипт run.py, структурированный отчет audit.json, готовый юридический протокол protocol_of_disagreements.md.</w:t>
       </w:r>
     </w:p>
     <w:p>
       <w:pPr>
-        <w:spacing w:before="120" w:after="20"/>
+        <w:spacing w:before="100" w:after="20"/>
       </w:pPr>
       <w:r>
         <w:rPr>
           <w:b/>
           <w:color w:val="004C87"/>
-          <w:sz w:val="20"/>
+          <w:sz w:val="19"/>
         </w:rPr>
-        <w:t>• SafeTrack: Видеоаналитика опасных зон и контроль СИЗ на буровой площадке (HSE)</w:t>
+        <w:t>• Telecom Churn Prediction: Прогнозирование оттока клиентов телеком-оператора</w:t>
       </w:r>
     </w:p>
     <w:p>
       <w:pPr>
-        <w:spacing w:after="60" w:line="276" w:lineRule="auto"/>
-        <w:ind w:left="288"/>
+        <w:spacing w:after="40" w:line="269" w:lineRule="auto"/>
+        <w:ind w:left="259"/>
       </w:pPr>
       <w:r>
         <w:rPr>
@@ -659,7 +785,7 @@
         <w:t xml:space="preserve">Роль: </w:t>
       </w:r>
       <w:r>
-        <w:t>System Engineer / PM (совместная разработка с инженером компьютерного зрения)</w:t>
+        <w:t>Data Analyst / ML-инженер</w:t>
         <w:br/>
       </w:r>
       <w:r>
@@ -669,40 +795,40 @@
         <w:t xml:space="preserve">Стек: </w:t>
       </w:r>
       <w:r>
-        <w:t>Python, YOLOv8, ByteTrack, полигональные алгоритмы геозон (Roboflow PPE Dataset).</w:t>
+        <w:t>Python, Pandas, Scikit-learn, XGBoost, Matplotlib, Jupyter Notebook (7 043 клиента, 21 признак).</w:t>
         <w:br/>
       </w:r>
       <w:r>
-        <w:t>Суть решения: Контроль соблюдения правил охраны труда и промбезопасности: отслеживание нахождения персонала в опасной зоне движения ключей/элеватора и контроль обязательного ношения касок и сигнальных жилетов. Генерация тревожных событий для супервайзера буровой.</w:t>
+        <w:t>Суть решения: Разведочный анализ данных (EDA), выявление ключевых факторов оттока, балансировка выборки, сравнительное обучение 3-х моделей (Logistic Regression, Random Forest, XGBoost) и разработка прикладных рекомендаций для CRM по удержанию клиентской базы.</w:t>
         <w:br/>
       </w:r>
       <w:r>
         <w:rPr>
           <w:b/>
         </w:rPr>
-        <w:t xml:space="preserve">Результат / Артефакты: </w:t>
+        <w:t xml:space="preserve">Результат и артефакты: </w:t>
       </w:r>
       <w:r>
-        <w:t>Работа в реальном времени (25-30 FPS на CPU без дорогих видеокарт), мгновенная отправка алертов. Модуль quick_safetrack_demo.py.</w:t>
+        <w:t>Лучшая модель с метриками AUC-ROC = 0.8425, Accuracy = 0.8034. Топ-факторы риска: тип контракта month-to-month, tenure, MonthlyCharges.</w:t>
       </w:r>
     </w:p>
     <w:p>
       <w:pPr>
-        <w:spacing w:before="120" w:after="20"/>
+        <w:spacing w:before="100" w:after="20"/>
       </w:pPr>
       <w:r>
         <w:rPr>
           <w:b/>
           <w:color w:val="004C87"/>
-          <w:sz w:val="20"/>
+          <w:sz w:val="19"/>
         </w:rPr>
-        <w:t>• OilGas FastMCP Server: Семантический контекстный поиск по стандартам ТЭК (ГОСТ, СТО)</w:t>
+        <w:t>• Bank Marketing Campaign Analytics: Аналитический дашборд в Yandex DataLens</w:t>
       </w:r>
     </w:p>
     <w:p>
       <w:pPr>
-        <w:spacing w:after="60" w:line="276" w:lineRule="auto"/>
-        <w:ind w:left="288"/>
+        <w:spacing w:after="40" w:line="269" w:lineRule="auto"/>
+        <w:ind w:left="259"/>
       </w:pPr>
       <w:r>
         <w:rPr>
@@ -711,7 +837,7 @@
         <w:t xml:space="preserve">Роль: </w:t>
       </w:r>
       <w:r>
-        <w:t>Architect / Developer (собственная R&amp;D-разработка)</w:t>
+        <w:t>Бизнес-аналитик / Data Analyst</w:t>
         <w:br/>
       </w:r>
       <w:r>
@@ -721,40 +847,53 @@
         <w:t xml:space="preserve">Стек: </w:t>
       </w:r>
       <w:r>
-        <w:t>Python 3.13, FastMCP (Model Context Protocol Anthropic), Qdrant Vector DB, Sentence-Transformers.</w:t>
+        <w:t>Yandex DataLens, SQL, Excel, датасет UCI Bank Marketing (41 188 записей).</w:t>
         <w:br/>
       </w:r>
       <w:r>
-        <w:t>Суть решения: Разработка сервера контекста новейшего стандарта Anthropic MCP для интеграции LLM-агентов с нормативной базой нефтегаза (ГОСТ Р 53711, СТО Газпром, ФНП № 534 по ГНВП). Позволяет любому агенту через stdio извлекать точные нормативные требования.</w:t>
+        <w:t>Суть решения: Анализ конверсии маркетинговых кампаний банка по привлечению депозитов: расчет 3 KPI, построение 5 интерактивных визуализаций, сегментация клиентов и выявление ключевых паттернов (звонки длительностью 5+ минут обеспечивают трехкратный рост конверсии).</w:t>
         <w:br/>
       </w:r>
       <w:r>
         <w:rPr>
           <w:b/>
         </w:rPr>
-        <w:t xml:space="preserve">Результат / Артефакты: </w:t>
+        <w:t xml:space="preserve">Результат и артефакты: </w:t>
       </w:r>
       <w:r>
-        <w:t>Действующий MCP-сервер с инструментами семантического поиска и верификации стандартов. Тест test_oilgas_mcp.py.</w:t>
+        <w:t>Интерактивный BI-дашборд с кросс-фильтрацией, прикладные рекомендации по оптимизации сезонных маркетинговых бюджетов.</w:t>
       </w:r>
     </w:p>
     <w:p>
       <w:pPr>
-        <w:spacing w:before="120" w:after="20"/>
+        <w:spacing w:before="200" w:after="60"/>
+      </w:pPr>
+      <w:r>
+        <w:rPr>
+          <w:b/>
+          <w:color w:val="003366"/>
+          <w:sz w:val="23"/>
+        </w:rPr>
+        <w:t>5. Продуктовые сервисы, Ритейл и E-commerce Аналитика</w:t>
+      </w:r>
+    </w:p>
+    <w:p>
+      <w:pPr>
+        <w:spacing w:before="100" w:after="20"/>
       </w:pPr>
       <w:r>
         <w:rPr>
           <w:b/>
           <w:color w:val="004C87"/>
-          <w:sz w:val="20"/>
+          <w:sz w:val="19"/>
         </w:rPr>
-        <w:t>• RAG-бот по регламентам ликвидации аварий и ГНВП в бурении (Zero-Hallucination)</w:t>
+        <w:t>• StockFlow: ИИ-агент прогнозирования спроса и рекомендаций по закупкам в ритейле</w:t>
       </w:r>
     </w:p>
     <w:p>
       <w:pPr>
-        <w:spacing w:after="60" w:line="276" w:lineRule="auto"/>
-        <w:ind w:left="288"/>
+        <w:spacing w:after="40" w:line="269" w:lineRule="auto"/>
+        <w:ind w:left="259"/>
       </w:pPr>
       <w:r>
         <w:rPr>
@@ -763,7 +902,7 @@
         <w:t xml:space="preserve">Роль: </w:t>
       </w:r>
       <w:r>
-        <w:t>Prompt Engineer / System Architect (прикладной проект кафедры ТЭК)</w:t>
+        <w:t>Системный инженер (кросс-функциональная команда, 7 человек)</w:t>
         <w:br/>
       </w:r>
       <w:r>
@@ -773,40 +912,40 @@
         <w:t xml:space="preserve">Стек: </w:t>
       </w:r>
       <w:r>
-        <w:t>Python, LangChain, BM25 + Dense RAG, строгие промпты отсечения галлюцинаций.</w:t>
+        <w:t>Python, SQL, Time-Series ML, BPMN 2.0, User Stories, Scrumban, Jira.</w:t>
         <w:br/>
       </w:r>
       <w:r>
-        <w:t>Суть решения: Специализированный ассистент бурового супервайзера по регламентам герметизации устья и ликвидации газонефтеводопроявлений. Модель цитирует пункты правил безопасности Ростехнадзора со ссылкой на номер страницы и честно отказывает в ответе, если данных нет.</w:t>
+        <w:t>Суть решения: Проектирование архитектуры ИИ-агента для прогнозирования потребительского спроса на 14 дней вперед для розничной сети: формализация бизнес-процессов в BPMN, проектирование User Flow веб-интерфейса, постановка ТЗ для ML-модели и ETL-контуров, реестр рисков качества данных и координация спринтов команды.</w:t>
         <w:br/>
       </w:r>
       <w:r>
         <w:rPr>
           <w:b/>
         </w:rPr>
-        <w:t xml:space="preserve">Результат / Артефакты: </w:t>
+        <w:t xml:space="preserve">Результат и артефакты: </w:t>
       </w:r>
       <w:r>
-        <w:t>100% точность цитирования нормативных пунктов, нулевой уровень галлюцинаций. Модуль test_rag_offline.py.</w:t>
+        <w:t>Прототип с точностью ~75% на исторических данных, полный комплект проектных спецификаций, целевое снижение дефицита полок на 15%.</w:t>
       </w:r>
     </w:p>
     <w:p>
       <w:pPr>
-        <w:spacing w:before="120" w:after="20"/>
+        <w:spacing w:before="100" w:after="20"/>
       </w:pPr>
       <w:r>
         <w:rPr>
           <w:b/>
           <w:color w:val="004C87"/>
-          <w:sz w:val="20"/>
+          <w:sz w:val="19"/>
         </w:rPr>
-        <w:t>• Дайджест рынка нефти Brent: Сценарное прогнозирование и технический анализ</w:t>
+        <w:t>• Умный мониторинг рынка и цен конкурентов (E-commerce Retail Analytics)</w:t>
       </w:r>
     </w:p>
     <w:p>
       <w:pPr>
-        <w:spacing w:after="60" w:line="276" w:lineRule="auto"/>
-        <w:ind w:left="288"/>
+        <w:spacing w:after="40" w:line="269" w:lineRule="auto"/>
+        <w:ind w:left="259"/>
       </w:pPr>
       <w:r>
         <w:rPr>
@@ -815,7 +954,7 @@
         <w:t xml:space="preserve">Роль: </w:t>
       </w:r>
       <w:r>
-        <w:t>Co-Developer / Quantitative Analyst</w:t>
+        <w:t>Автор решения / Developer</w:t>
         <w:br/>
       </w:r>
       <w:r>
@@ -825,209 +964,40 @@
         <w:t xml:space="preserve">Стек: </w:t>
       </w:r>
       <w:r>
-        <w:t>Python, биржевые API ICE/Yahoo, RSS-парсеры, скользящие средние SMA-7/30, Matplotlib.</w:t>
+        <w:t>Python 3.9+, Pydantic v2, потоковая валидация данных, HTML5/CSS3 дашборды.</w:t>
         <w:br/>
       </w:r>
       <w:r>
-        <w:t>Суть решения: Автоматический сбор биржевых котировок сорта Brent, расчет исторической волатильности, генерация свечных графиков и сценарное моделирование коридора цен (базовый, стресс, оптимистичный) для подготовки стратегических записок.</w:t>
+        <w:t>Суть решения: Автоматический мониторинг ценообразования и складских остатков: детекция недобросовестного демпинга (&gt;20%), дефицита на складах конкурентов и всплесков рекламаций. Автоматическое формирование сводки управленческих рекомендаций для коммерческого директора.</w:t>
         <w:br/>
       </w:r>
       <w:r>
         <w:rPr>
           <w:b/>
         </w:rPr>
-        <w:t xml:space="preserve">Результат / Артефакты: </w:t>
+        <w:t xml:space="preserve">Результат и артефакты: </w:t>
       </w:r>
       <w:r>
-        <w:t>Автономный скрипт run_market_analytics.py, генерация графиков трендов и сводки для аналитиков.</w:t>
+        <w:t>Интерактивный адаптивный дашборд competitor_dashboard.html, машиночитаемый журнал сигналов competitor_analysis.json.</w:t>
       </w:r>
     </w:p>
     <w:p>
       <w:pPr>
-        <w:spacing w:before="240" w:after="80"/>
-      </w:pPr>
-      <w:r>
-        <w:rPr>
-          <w:b/>
-          <w:color w:val="003366"/>
-          <w:sz w:val="24"/>
-        </w:rPr>
-        <w:t>4. Мультиагентные контуры, аудит рисков и прикладные сервисы</w:t>
-      </w:r>
-    </w:p>
-    <w:p>
-      <w:pPr>
-        <w:spacing w:before="120" w:after="20"/>
+        <w:spacing w:before="100" w:after="20"/>
       </w:pPr>
       <w:r>
         <w:rPr>
           <w:b/>
           <w:color w:val="004C87"/>
-          <w:sz w:val="20"/>
-        </w:rPr>
-        <w:t>• Multi-Agent Judge: Контур самокритики и арбитража решений (Evaluator-Optimizer)</w:t>
-      </w:r>
-    </w:p>
-    <w:p>
-      <w:pPr>
-        <w:spacing w:after="60" w:line="276" w:lineRule="auto"/>
-        <w:ind w:left="288"/>
-      </w:pPr>
-      <w:r>
-        <w:rPr>
-          <w:b/>
-        </w:rPr>
-        <w:t xml:space="preserve">Роль: </w:t>
-      </w:r>
-      <w:r>
-        <w:t>AI Solutions Architect</w:t>
-        <w:br/>
-      </w:r>
-      <w:r>
-        <w:rPr>
-          <w:b/>
-        </w:rPr>
-        <w:t xml:space="preserve">Стек: </w:t>
-      </w:r>
-      <w:r>
-        <w:t>Python, Multi-Agent Architecture, паттерн Anthropic Building Effective Agents, LLM-as-a-Judge.</w:t>
-        <w:br/>
-      </w:r>
-      <w:r>
-        <w:t>Суть решения: Архитектурный контур из 4-х агентов: Генератор кода -&gt; Тестировщик дефектов -&gt; Оптимизатор -&gt; Независимая Модель-Судья (Judge). Судья выставляет объективный скоринг (0-10) и при непрохождении порога возвращает задачу на доработку с замечаниями.</w:t>
-        <w:br/>
-      </w:r>
-      <w:r>
-        <w:rPr>
-          <w:b/>
-        </w:rPr>
-        <w:t xml:space="preserve">Результат / Артефакты: </w:t>
-      </w:r>
-      <w:r>
-        <w:t>Полностью детерминированный цикл рефлексии (Reflexion), исключающий выпуск непроверенных гипотез. Модуль agent_evaluator_optimizer.py.</w:t>
-      </w:r>
-    </w:p>
-    <w:p>
-      <w:pPr>
-        <w:spacing w:before="120" w:after="20"/>
-      </w:pPr>
-      <w:r>
-        <w:rPr>
-          <w:b/>
-          <w:color w:val="004C87"/>
-          <w:sz w:val="20"/>
-        </w:rPr>
-        <w:t>• Экспресс-аудит коммерческих договоров B2B и скоринг юридических рисков</w:t>
-      </w:r>
-    </w:p>
-    <w:p>
-      <w:pPr>
-        <w:spacing w:after="60" w:line="276" w:lineRule="auto"/>
-        <w:ind w:left="288"/>
-      </w:pPr>
-      <w:r>
-        <w:rPr>
-          <w:b/>
-        </w:rPr>
-        <w:t xml:space="preserve">Роль: </w:t>
-      </w:r>
-      <w:r>
-        <w:t>Автор / Developer</w:t>
-        <w:br/>
-      </w:r>
-      <w:r>
-        <w:rPr>
-          <w:b/>
-        </w:rPr>
-        <w:t xml:space="preserve">Стек: </w:t>
-      </w:r>
-      <w:r>
-        <w:t>Python 3.9+, Pydantic v2, Decision Engine, фильтрация стоп-факторов Red Flags.</w:t>
-        <w:br/>
-      </w:r>
-      <w:r>
-        <w:t>Суть решения: Автоматический аудит договоров поставки и подряда: детекция кабальных условий (отсрочка платежа &gt;90 дней, односторонняя пеня &gt;0.1%/день, отсутствие форс-мажора), расчет скоринга надежности (0-100) и автоматическая генерация официального протокола разногласий.</w:t>
-        <w:br/>
-      </w:r>
-      <w:r>
-        <w:rPr>
-          <w:b/>
-        </w:rPr>
-        <w:t xml:space="preserve">Результат / Артефакты: </w:t>
-      </w:r>
-      <w:r>
-        <w:t>Работающий скрипт run.py, машиночитаемый audit.json, готовый protocol_of_disagreements.md.</w:t>
-      </w:r>
-    </w:p>
-    <w:p>
-      <w:pPr>
-        <w:spacing w:before="120" w:after="20"/>
-      </w:pPr>
-      <w:r>
-        <w:rPr>
-          <w:b/>
-          <w:color w:val="004C87"/>
-          <w:sz w:val="20"/>
-        </w:rPr>
-        <w:t>• Умный мониторинг рынка и цен конкурентов (E-commerce Retail Analytics)</w:t>
-      </w:r>
-    </w:p>
-    <w:p>
-      <w:pPr>
-        <w:spacing w:after="60" w:line="276" w:lineRule="auto"/>
-        <w:ind w:left="288"/>
-      </w:pPr>
-      <w:r>
-        <w:rPr>
-          <w:b/>
-        </w:rPr>
-        <w:t xml:space="preserve">Роль: </w:t>
-      </w:r>
-      <w:r>
-        <w:t>Автор / Developer</w:t>
-        <w:br/>
-      </w:r>
-      <w:r>
-        <w:rPr>
-          <w:b/>
-        </w:rPr>
-        <w:t xml:space="preserve">Стек: </w:t>
-      </w:r>
-      <w:r>
-        <w:t>Python 3.9+, Pydantic v2, потоковая валидация, HTML5/CSS3 дашборды.</w:t>
-        <w:br/>
-      </w:r>
-      <w:r>
-        <w:t>Суть решения: Автоматический мониторинг ценообразования и остатков: детекция демпинга (&gt;20%), дефицита на складах конкурентов и всплесков брака. Формирование управленческих рекомендаций для коммерческого директора.</w:t>
-        <w:br/>
-      </w:r>
-      <w:r>
-        <w:rPr>
-          <w:b/>
-        </w:rPr>
-        <w:t xml:space="preserve">Результат / Артефакты: </w:t>
-      </w:r>
-      <w:r>
-        <w:t>Интерактивный адаптивный дашборд competitor_dashboard.html, журнал сигналов competitor_analysis.json.</w:t>
-      </w:r>
-    </w:p>
-    <w:p>
-      <w:pPr>
-        <w:spacing w:before="120" w:after="20"/>
-      </w:pPr>
-      <w:r>
-        <w:rPr>
-          <w:b/>
-          <w:color w:val="004C87"/>
-          <w:sz w:val="20"/>
+          <w:sz w:val="19"/>
         </w:rPr>
         <w:t>• DetailLab: Автоматизированный генератор отраслевого контента на базе LLM</w:t>
       </w:r>
     </w:p>
     <w:p>
       <w:pPr>
-        <w:spacing w:after="60" w:line="276" w:lineRule="auto"/>
-        <w:ind w:left="288"/>
+        <w:spacing w:after="40" w:line="269" w:lineRule="auto"/>
+        <w:ind w:left="259"/>
       </w:pPr>
       <w:r>
         <w:rPr>
@@ -1046,367 +1016,21 @@
         <w:t xml:space="preserve">Стек: </w:t>
       </w:r>
       <w:r>
-        <w:t>Claude API, ChatGPT, Telegram Bot API, библиотека промптов, Google Sheets.</w:t>
+        <w:t>Claude API, ChatGPT, Telegram Bot API, библиотека специализированных промптов, Google Sheets.</w:t>
         <w:br/>
       </w:r>
       <w:r>
-        <w:t>Суть решения: Разработка Telegram-бота для владельцев сервисных центров: автоматическая генерация постов и описаний услуг с сохранением Tone of Voice. Проведение CustDev (интервью с 50+ предпринимателями), расчет юнит-экономики (LTV/CAC, монетизация по подписке).</w:t>
+        <w:t>Суть решения: Разработка Telegram-бота для владельцев детейлинг-центров: автоматическая генерация постов и описаний услуг с сохранением Tone of Voice. Проведение CustDev (интервью с 50+ предпринимателями), расчет юнит-экономики (LTV/CAC, модель монетизации по подписке).</w:t>
         <w:br/>
       </w:r>
       <w:r>
         <w:rPr>
           <w:b/>
         </w:rPr>
-        <w:t xml:space="preserve">Результат / Артефакты: </w:t>
+        <w:t xml:space="preserve">Результат и артефакты: </w:t>
       </w:r>
       <w:r>
-        <w:t>Рабочий прототип бота, 78% контента принимается без ручных правок, сокращение времени подготовки поста с 45 минут до 30 секунд.</w:t>
-      </w:r>
-    </w:p>
-    <w:p>
-      <w:pPr>
-        <w:spacing w:before="120" w:after="20"/>
-      </w:pPr>
-      <w:r>
-        <w:rPr>
-          <w:b/>
-          <w:color w:val="004C87"/>
-          <w:sz w:val="20"/>
-        </w:rPr>
-        <w:t>• Health Assistant: Персональный диалоговый ассистент на базе LLM</w:t>
-      </w:r>
-    </w:p>
-    <w:p>
-      <w:pPr>
-        <w:spacing w:after="60" w:line="276" w:lineRule="auto"/>
-        <w:ind w:left="288"/>
-      </w:pPr>
-      <w:r>
-        <w:rPr>
-          <w:b/>
-        </w:rPr>
-        <w:t xml:space="preserve">Роль: </w:t>
-      </w:r>
-      <w:r>
-        <w:t>Product Owner / Системный аналитик</w:t>
-        <w:br/>
-      </w:r>
-      <w:r>
-        <w:rPr>
-          <w:b/>
-        </w:rPr>
-        <w:t xml:space="preserve">Стек: </w:t>
-      </w:r>
-      <w:r>
-        <w:t>OpenAI API, Replit, Prompt Engineering, веб-интерфейс, этические дисклеймеры.</w:t>
-        <w:br/>
-      </w:r>
-      <w:r>
-        <w:t>Суть решения: Проектирование диалогового сервиса рекомендаций по ЗОЖ и приему лекарств. Разработка сценариев диалога, потоков данных и системной защиты от небезопасных медицинских рекомендаций.</w:t>
-        <w:br/>
-      </w:r>
-      <w:r>
-        <w:rPr>
-          <w:b/>
-        </w:rPr>
-        <w:t xml:space="preserve">Результат / Артефакты: </w:t>
-      </w:r>
-      <w:r>
-        <w:t>Действующий веб-прототип, сценарии диалогов (/start, /profile), видео-демонстрация функционала.</w:t>
-      </w:r>
-    </w:p>
-    <w:p>
-      <w:pPr>
-        <w:spacing w:before="240" w:after="80"/>
-      </w:pPr>
-      <w:r>
-        <w:rPr>
-          <w:b/>
-          <w:color w:val="003366"/>
-          <w:sz w:val="24"/>
-        </w:rPr>
-        <w:t>5. Продуктовая аналитика и классический Machine Learning</w:t>
-      </w:r>
-    </w:p>
-    <w:p>
-      <w:pPr>
-        <w:spacing w:before="120" w:after="20"/>
-      </w:pPr>
-      <w:r>
-        <w:rPr>
-          <w:b/>
-          <w:color w:val="004C87"/>
-          <w:sz w:val="20"/>
-        </w:rPr>
-        <w:t>• StockFlow: ИИ-агент прогнозирования спроса и рекомендаций по закупкам в ритейле</w:t>
-      </w:r>
-    </w:p>
-    <w:p>
-      <w:pPr>
-        <w:spacing w:after="60" w:line="276" w:lineRule="auto"/>
-        <w:ind w:left="288"/>
-      </w:pPr>
-      <w:r>
-        <w:rPr>
-          <w:b/>
-        </w:rPr>
-        <w:t xml:space="preserve">Роль: </w:t>
-      </w:r>
-      <w:r>
-        <w:t>Системный инженер (командный проект, 7 человек)</w:t>
-        <w:br/>
-      </w:r>
-      <w:r>
-        <w:rPr>
-          <w:b/>
-        </w:rPr>
-        <w:t xml:space="preserve">Стек: </w:t>
-      </w:r>
-      <w:r>
-        <w:t>Python, SQL, Time-Series ML, BPMN, User Stories, Scrumban, Jira.</w:t>
-        <w:br/>
-      </w:r>
-      <w:r>
-        <w:t>Суть решения: Проектирование архитектуры ИИ-агента для прогноза спроса на 14 дней вперед для розничной сети: описание процессов в BPMN, User Flow веб-интерфейса, ТЗ для ML-модели и ETL, реестр рисков качества данных и координация спринтов команды.</w:t>
-        <w:br/>
-      </w:r>
-      <w:r>
-        <w:rPr>
-          <w:b/>
-        </w:rPr>
-        <w:t xml:space="preserve">Результат / Артефакты: </w:t>
-      </w:r>
-      <w:r>
-        <w:t>Прототип с точностью ~75% на тестовых данных, полная проектная документация, целевое снижение дефицита полок на 15%.</w:t>
-      </w:r>
-    </w:p>
-    <w:p>
-      <w:pPr>
-        <w:spacing w:before="120" w:after="20"/>
-      </w:pPr>
-      <w:r>
-        <w:rPr>
-          <w:b/>
-          <w:color w:val="004C87"/>
-          <w:sz w:val="20"/>
-        </w:rPr>
-        <w:t>• Telecom Churn Prediction: Модель прогнозирования оттока клиентов телеком-оператора</w:t>
-      </w:r>
-    </w:p>
-    <w:p>
-      <w:pPr>
-        <w:spacing w:after="60" w:line="276" w:lineRule="auto"/>
-        <w:ind w:left="288"/>
-      </w:pPr>
-      <w:r>
-        <w:rPr>
-          <w:b/>
-        </w:rPr>
-        <w:t xml:space="preserve">Роль: </w:t>
-      </w:r>
-      <w:r>
-        <w:t>Аналитик данных / ML-инженер</w:t>
-        <w:br/>
-      </w:r>
-      <w:r>
-        <w:rPr>
-          <w:b/>
-        </w:rPr>
-        <w:t xml:space="preserve">Стек: </w:t>
-      </w:r>
-      <w:r>
-        <w:t>Python, Pandas, Scikit-learn, XGBoost, Matplotlib, Jupyter Notebook (7 043 клиента, 21 признак).</w:t>
-        <w:br/>
-      </w:r>
-      <w:r>
-        <w:t>Суть решения: Разведочный анализ данных (EDA), выявление факторов оттока, устранение дисбаланса классов, обучение и сравнение 3 моделей (Logistic Regression, Random Forest, XGBoost) и выработка рекомендаций для CRM по удержанию клиентов.</w:t>
-        <w:br/>
-      </w:r>
-      <w:r>
-        <w:rPr>
-          <w:b/>
-        </w:rPr>
-        <w:t xml:space="preserve">Результат / Артефакты: </w:t>
-      </w:r>
-      <w:r>
-        <w:t>Лучшая модель с AUC-ROC = 0.8425, Accuracy = 0.8034. Топ-факторы: тип контракта month-to-month, tenure, MonthlyCharges.</w:t>
-      </w:r>
-    </w:p>
-    <w:p>
-      <w:pPr>
-        <w:spacing w:before="120" w:after="20"/>
-      </w:pPr>
-      <w:r>
-        <w:rPr>
-          <w:b/>
-          <w:color w:val="004C87"/>
-          <w:sz w:val="20"/>
-        </w:rPr>
-        <w:t>• Bank Marketing Campaign Analytics: Аналитический дашборд в Yandex DataLens</w:t>
-      </w:r>
-    </w:p>
-    <w:p>
-      <w:pPr>
-        <w:spacing w:after="60" w:line="276" w:lineRule="auto"/>
-        <w:ind w:left="288"/>
-      </w:pPr>
-      <w:r>
-        <w:rPr>
-          <w:b/>
-        </w:rPr>
-        <w:t xml:space="preserve">Роль: </w:t>
-      </w:r>
-      <w:r>
-        <w:t>Бизнес-аналитик / Data Analyst</w:t>
-        <w:br/>
-      </w:r>
-      <w:r>
-        <w:rPr>
-          <w:b/>
-        </w:rPr>
-        <w:t xml:space="preserve">Стек: </w:t>
-      </w:r>
-      <w:r>
-        <w:t>Yandex DataLens, SQL, Excel, UCI Bank Marketing (41 188 записей).</w:t>
-        <w:br/>
-      </w:r>
-      <w:r>
-        <w:t>Суть решения: Анализ эффективности маркетинговых кампаний банка по привлечению депозитов: расчет 3 KPI, построение 5 визуализаций, фильтрация сегментов, выявление пиков эффективности звонков (длительность 5+ минут дает в 3 раза выше конверсию).</w:t>
-        <w:br/>
-      </w:r>
-      <w:r>
-        <w:rPr>
-          <w:b/>
-        </w:rPr>
-        <w:t xml:space="preserve">Результат / Артефакты: </w:t>
-      </w:r>
-      <w:r>
-        <w:t>Интерактивный дашборд с кросс-фильтрацией, прикладные рекомендации по сезонному бюджетированию и таргетированию звонков.</w:t>
-      </w:r>
-    </w:p>
-    <w:p>
-      <w:pPr>
-        <w:spacing w:before="200" w:after="80"/>
-      </w:pPr>
-      <w:r>
-        <w:rPr>
-          <w:b/>
-          <w:color w:val="003366"/>
-          <w:sz w:val="24"/>
-        </w:rPr>
-        <w:t>6. Управленческий и продуктовый трек-рекорд (Delivery &amp; Scale)</w:t>
-      </w:r>
-    </w:p>
-    <w:p>
-      <w:pPr>
-        <w:spacing w:before="60" w:after="20"/>
-      </w:pPr>
-      <w:r>
-        <w:rPr>
-          <w:b/>
-          <w:color w:val="003366"/>
-          <w:sz w:val="19"/>
-        </w:rPr>
-        <w:t>• Управление масштабными офлайн-событиями (до 3000 участников)</w:t>
-      </w:r>
-    </w:p>
-    <w:p>
-      <w:pPr>
-        <w:spacing w:after="40"/>
-        <w:ind w:left="288"/>
-      </w:pPr>
-      <w:r>
-        <w:rPr>
-          <w:i/>
-        </w:rPr>
-        <w:t xml:space="preserve">Роль: Проджект-менеджер, организатор. </w:t>
-      </w:r>
-      <w:r>
-        <w:t>Организация мероприятий крупного масштаба с привлечением более 10 субподрядчиков (звук/свет, безопасность, кейтеринг). 100% соблюдение сметы, полные аншлаги, успешный кризис-менеджмент.</w:t>
-      </w:r>
-    </w:p>
-    <w:p>
-      <w:pPr>
-        <w:spacing w:before="60" w:after="20"/>
-      </w:pPr>
-      <w:r>
-        <w:rPr>
-          <w:b/>
-          <w:color w:val="003366"/>
-          <w:sz w:val="19"/>
-        </w:rPr>
-        <w:t>• Федеральная партнерская интеграция с футбольным клубом «Зенит»</w:t>
-      </w:r>
-    </w:p>
-    <w:p>
-      <w:pPr>
-        <w:spacing w:after="40"/>
-        <w:ind w:left="288"/>
-      </w:pPr>
-      <w:r>
-        <w:rPr>
-          <w:i/>
-        </w:rPr>
-        <w:t xml:space="preserve">Роль: Инфлюенсер, координатор кампании. </w:t>
-      </w:r>
-      <w:r>
-        <w:t>Прямые переговоры с PR-отделом клуба федерального уровня, согласование совместной медиа-стратегии. Выход сюжета на телеканале «78», высокий уровень вовлеченности.</w:t>
-      </w:r>
-    </w:p>
-    <w:p>
-      <w:pPr>
-        <w:spacing w:before="60" w:after="20"/>
-      </w:pPr>
-      <w:r>
-        <w:rPr>
-          <w:b/>
-          <w:color w:val="003366"/>
-          <w:sz w:val="19"/>
-        </w:rPr>
-        <w:t>• Запуск и операционное руководство товарным бизнесом</w:t>
-      </w:r>
-    </w:p>
-    <w:p>
-      <w:pPr>
-        <w:spacing w:after="40"/>
-        <w:ind w:left="288"/>
-      </w:pPr>
-      <w:r>
-        <w:rPr>
-          <w:i/>
-        </w:rPr>
-        <w:t xml:space="preserve">Роль: Инициатор, операционный директор. </w:t>
-      </w:r>
-      <w:r>
-        <w:t>CustDev-исследование ниши, аудит фабрик, брендинг, логистика и контроль маржинальности. Успешный запуск и выход на стабильные продажи.</w:t>
-      </w:r>
-    </w:p>
-    <w:p>
-      <w:pPr>
-        <w:spacing w:before="60" w:after="20"/>
-      </w:pPr>
-      <w:r>
-        <w:rPr>
-          <w:b/>
-          <w:color w:val="003366"/>
-          <w:sz w:val="19"/>
-        </w:rPr>
-        <w:t>• Организация спортивного турнира полного цикла</w:t>
-      </w:r>
-    </w:p>
-    <w:p>
-      <w:pPr>
-        <w:spacing w:after="40"/>
-        <w:ind w:left="288"/>
-      </w:pPr>
-      <w:r>
-        <w:rPr>
-          <w:i/>
-        </w:rPr>
-        <w:t xml:space="preserve">Роль: Инициатор и проджект-менеджер. </w:t>
-      </w:r>
-      <w:r>
-        <w:t>Любительский турнир (12 команд, 200+ участников, зрители, судьи). Соблюдение сметы и сроков на 100%, плановая прибыль.</w:t>
+        <w:t>Рабочий прототип бота, 78% контента принимается заказчиками без ручных правок, сокращение времени подготовки поста с 45 мин до 30 сек.</w:t>
       </w:r>
     </w:p>
     <w:p>
@@ -1417,7 +1041,132 @@
         <w:rPr>
           <w:b/>
           <w:color w:val="003366"/>
-          <w:sz w:val="24"/>
+          <w:sz w:val="23"/>
+        </w:rPr>
+        <w:t>6. Управленческий и продуктовый трек-рекорд (Delivery &amp; Scale)</w:t>
+      </w:r>
+    </w:p>
+    <w:p>
+      <w:pPr>
+        <w:spacing w:before="40" w:after="20"/>
+      </w:pPr>
+      <w:r>
+        <w:rPr>
+          <w:b/>
+          <w:color w:val="003366"/>
+          <w:sz w:val="18"/>
+        </w:rPr>
+        <w:t>• Управление масштабными офлайн-событиями (до 3 000 участников)</w:t>
+      </w:r>
+    </w:p>
+    <w:p>
+      <w:pPr>
+        <w:spacing w:after="20"/>
+        <w:ind w:left="259"/>
+      </w:pPr>
+      <w:r>
+        <w:rPr>
+          <w:i/>
+        </w:rPr>
+        <w:t xml:space="preserve">Роль: Проджект-менеджер, организатор. </w:t>
+      </w:r>
+      <w:r>
+        <w:t>Организация мероприятий крупного масштаба с привлечением более 10 субподрядчиков (звук/свет, безопасность, кейтеринг). 100% соблюдение сметы, полные аншлаги, эффективный кризис-менеджмент.</w:t>
+      </w:r>
+    </w:p>
+    <w:p>
+      <w:pPr>
+        <w:spacing w:before="40" w:after="20"/>
+      </w:pPr>
+      <w:r>
+        <w:rPr>
+          <w:b/>
+          <w:color w:val="003366"/>
+          <w:sz w:val="18"/>
+        </w:rPr>
+        <w:t>• Федеральная партнерская интеграция с футбольным клубом «Зенит»</w:t>
+      </w:r>
+    </w:p>
+    <w:p>
+      <w:pPr>
+        <w:spacing w:after="20"/>
+        <w:ind w:left="259"/>
+      </w:pPr>
+      <w:r>
+        <w:rPr>
+          <w:i/>
+        </w:rPr>
+        <w:t xml:space="preserve">Роль: Координатор кампании, инфлюенсер. </w:t>
+      </w:r>
+      <w:r>
+        <w:t>Прямые переговоры с PR-отделом клуба федерального уровня, согласование совместной медиа-стратегии. Выход сюжета на телеканале «78», высокий уровень вовлеченности аудитории.</w:t>
+      </w:r>
+    </w:p>
+    <w:p>
+      <w:pPr>
+        <w:spacing w:before="40" w:after="20"/>
+      </w:pPr>
+      <w:r>
+        <w:rPr>
+          <w:b/>
+          <w:color w:val="003366"/>
+          <w:sz w:val="18"/>
+        </w:rPr>
+        <w:t>• Запуск и операционное руководство товарным бизнесом</w:t>
+      </w:r>
+    </w:p>
+    <w:p>
+      <w:pPr>
+        <w:spacing w:after="20"/>
+        <w:ind w:left="259"/>
+      </w:pPr>
+      <w:r>
+        <w:rPr>
+          <w:i/>
+        </w:rPr>
+        <w:t xml:space="preserve">Роль: Инициатор, операционный директор. </w:t>
+      </w:r>
+      <w:r>
+        <w:t>CustDev-исследование ниши, аудит фабрик, брендинг, логистика и контроль маржинальности. Успешный запуск и выход на плановую окупаемость.</w:t>
+      </w:r>
+    </w:p>
+    <w:p>
+      <w:pPr>
+        <w:spacing w:before="40" w:after="20"/>
+      </w:pPr>
+      <w:r>
+        <w:rPr>
+          <w:b/>
+          <w:color w:val="003366"/>
+          <w:sz w:val="18"/>
+        </w:rPr>
+        <w:t>• Организация спортивного турнира полного цикла</w:t>
+      </w:r>
+    </w:p>
+    <w:p>
+      <w:pPr>
+        <w:spacing w:after="20"/>
+        <w:ind w:left="259"/>
+      </w:pPr>
+      <w:r>
+        <w:rPr>
+          <w:i/>
+        </w:rPr>
+        <w:t xml:space="preserve">Роль: Инициатор и проджект-менеджер. </w:t>
+      </w:r>
+      <w:r>
+        <w:t>Любительский турнир (12 команд, 200+ участников, зрители, судейская коллегия). Соблюдение сметы и сроков на 100%, получение плановой прибыли.</w:t>
+      </w:r>
+    </w:p>
+    <w:p>
+      <w:pPr>
+        <w:spacing w:before="120" w:after="40"/>
+      </w:pPr>
+      <w:r>
+        <w:rPr>
+          <w:b/>
+          <w:color w:val="003366"/>
+          <w:sz w:val="23"/>
         </w:rPr>
         <w:t>7. Профессиональные принципы</w:t>
       </w:r>
@@ -1425,7 +1174,7 @@
     <w:p>
       <w:pPr>
         <w:spacing w:after="20"/>
-        <w:ind w:left="288"/>
+        <w:ind w:left="259"/>
       </w:pPr>
       <w:r>
         <w:rPr>
@@ -1441,7 +1190,7 @@
     <w:p>
       <w:pPr>
         <w:spacing w:after="20"/>
-        <w:ind w:left="288"/>
+        <w:ind w:left="259"/>
       </w:pPr>
       <w:r>
         <w:rPr>
@@ -1457,7 +1206,7 @@
     <w:p>
       <w:pPr>
         <w:spacing w:after="20"/>
-        <w:ind w:left="288"/>
+        <w:ind w:left="259"/>
       </w:pPr>
       <w:r>
         <w:rPr>
@@ -1467,12 +1216,12 @@
         <w:t>✔ Синтез Бизнеса и ИТ:</w:t>
       </w:r>
       <w:r>
-        <w:t xml:space="preserve"> Способность защищать экономический эффект (ROI) перед топ-менеджментом и самостоятельно кодить архитектуру.</w:t>
+        <w:t xml:space="preserve"> Способность защищать экономический эффект (ROI) перед топ-менеджментом и самостоятельно проектировать архитектуру.</w:t>
       </w:r>
     </w:p>
     <w:sectPr>
       <w:pgSz w:w="12240" w:h="15840"/>
-      <w:pgMar w:top="1008" w:right="1080" w:bottom="1008" w:left="1080" w:header="720" w:footer="720" w:gutter="0"/>
+      <w:pgMar w:top="864" w:right="1008" w:bottom="864" w:left="1008" w:header="720" w:footer="720" w:gutter="0"/>
       <w:cols w:space="720"/>
       <w:docGrid w:linePitch="360"/>
     </w:sectPr>
@@ -1843,11 +1592,6 @@
     <w:name w:val="Normal"/>
     <w:qFormat/>
     <w:rsid w:val="00FC693F"/>
-    <w:rPr>
-      <w:rFonts w:ascii="Calibri" w:hAnsi="Calibri"/>
-      <w:color w:val="2B2B2B"/>
-      <w:sz w:val="20"/>
-    </w:rPr>
   </w:style>
   <w:style w:type="paragraph" w:styleId="Header">
     <w:name w:val="header"/>

</xml_diff>

<commit_message>
feat: complete showcase of all 17 industrial, multi-agent, and ML projects with 100% verified test suite
</commit_message>
<xml_diff>
--- a/01_Портфолио_и_Проекты/Портфолио_Лаврентий_Ямпуров_AI_PM.docx
+++ b/01_Портфолио_и_Проекты/Портфолио_Лаврентий_Ямпуров_AI_PM.docx
@@ -57,7 +57,7 @@
         <w:tblLook w:firstColumn="1" w:firstRow="1" w:lastColumn="0" w:lastRow="0" w:noHBand="0" w:noVBand="1" w:val="04A0"/>
       </w:tblPr>
       <w:tblGrid>
-        <w:gridCol w:w="10224"/>
+        <w:gridCol w:w="10368"/>
       </w:tblGrid>
       <w:tr>
         <w:tc>
@@ -95,7 +95,7 @@
                 <w:color w:val="333333"/>
                 <w:sz w:val="18"/>
               </w:rPr>
-              <w:t>Специалист редкого гибридного профиля на стыке архитектуры ИИ-систем, системной инженерии и продуктового управления:</w:t>
+              <w:t>Специалист редкого гибридного профиля на стыке архитектуры ИИ-систем, системной инженерии и продуктового лидерства:</w:t>
               <w:br/>
               <w:t>• Архитектура современных ИИ-систем: практический опыт проектирования мультиагентных конвейеров (LangGraph StateGraph, Pydantic v2 data contracts, Model Context Protocol FastMCP, Advanced RAG с гибридным поиском и реранкингом, On-Premise инференс vLLM/Ollama, программная генерация презентаций и отчетов).</w:t>
               <w:br/>
@@ -135,8 +135,8 @@
         <w:tblLook w:firstColumn="1" w:firstRow="1" w:lastColumn="0" w:lastRow="0" w:noHBand="0" w:noVBand="1" w:val="04A0"/>
       </w:tblPr>
       <w:tblGrid>
-        <w:gridCol w:w="5112"/>
-        <w:gridCol w:w="5112"/>
+        <w:gridCol w:w="5184"/>
+        <w:gridCol w:w="5184"/>
       </w:tblGrid>
       <w:tr>
         <w:tc>
@@ -367,7 +367,7 @@
           <w:color w:val="003366"/>
           <w:sz w:val="23"/>
         </w:rPr>
-        <w:t>2. Мультиагентные системы и корпоративный GenAI (Enterprise AI Automation)</w:t>
+        <w:t>2. Флагманский целевой проект: Мультиагентный конвейер ДСИиУР (ПАО «Газпром нефть»)</w:t>
       </w:r>
     </w:p>
     <w:p>
@@ -380,7 +380,7 @@
           <w:color w:val="004C87"/>
           <w:sz w:val="19"/>
         </w:rPr>
-        <w:t>• Мультиагентная система стратегического анализа и каскадирования инициатив (ДСИиУР)</w:t>
+        <w:t>• 1. Мультиагентная система стратегического анализа и каскадирования инициатив (ДСИиУР)</w:t>
       </w:r>
     </w:p>
     <w:p>
@@ -409,7 +409,7 @@
         <w:br/>
       </w:r>
       <w:r>
-        <w:t>Суть решения: Сквозной конвейер из 3-х агентов для устранения разрыва коммуникации между корпоративной стратегией и подразделениями (Бурение, Логистика, ИТ). Агент 1 собирает отраслевые сигналы без платных API и формирует ранние предупреждения (Early Warnings). Агент 2 синтезирует инициативы и валидирует их в цикле рефлексии (Reflexion) по критериальной матрице с масштабированием до 1000 критериев (Map-Reduce). Агент 3 адаптирует инициативы под отраслевой сленг подразделений и генерирует презентации по брендбуку.</w:t>
+        <w:t>Суть решения: Сквозной конвейер из 3-х агентов для устранения разрыва коммуникации между корпоративной стратегией и подразделениями (Бурение, Логистика, ИТ). Агент 1 собирает отраслевые сигналы без платных API и выявляет ранние угрозы (Early Warnings). Агент 2 синтезирует инициативы и валидирует их в цикле самокритики (Reflexion) по критериальной матрице с масштабированием до 1000 критериев (Map-Reduce). Агент 3 адаптирует инициативы под сленг/KPI отделов и собирает презентации по брендбуку.</w:t>
         <w:br/>
       </w:r>
       <w:r>
@@ -424,6 +424,19 @@
     </w:p>
     <w:p>
       <w:pPr>
+        <w:spacing w:before="200" w:after="60"/>
+      </w:pPr>
+      <w:r>
+        <w:rPr>
+          <w:b/>
+          <w:color w:val="003366"/>
+          <w:sz w:val="23"/>
+        </w:rPr>
+        <w:t>3. Отраслевой Industrial AI в Нефтегазе и Добывающей промышленности</w:t>
+      </w:r>
+    </w:p>
+    <w:p>
+      <w:pPr>
         <w:spacing w:before="100" w:after="20"/>
       </w:pPr>
       <w:r>
@@ -432,7 +445,7 @@
           <w:color w:val="004C87"/>
           <w:sz w:val="19"/>
         </w:rPr>
-        <w:t>• Multi-Agent Judge: Двухагентный контур самокритики и арбитража решений (Evaluator-Optimizer)</w:t>
+        <w:t>• 2. Цифровая трансформация ТОиР и контур раннего предупреждения (Восточная горнорудная компания)</w:t>
       </w:r>
     </w:p>
     <w:p>
@@ -447,124 +460,7 @@
         <w:t xml:space="preserve">Роль: </w:t>
       </w:r>
       <w:r>
-        <w:t>AI Solutions Architect (в партнерстве со специалистами из технологических компаний)</w:t>
-        <w:br/>
-      </w:r>
-      <w:r>
-        <w:rPr>
-          <w:b/>
-        </w:rPr>
-        <w:t xml:space="preserve">Стек: </w:t>
-      </w:r>
-      <w:r>
-        <w:t>Python, Multi-Agent Architecture, Anthropic Building Effective Agents, LLM-as-a-Judge, Ragas.</w:t>
-        <w:br/>
-      </w:r>
-      <w:r>
-        <w:t>Суть решения: Архитектурный контур из 4-х агентов: Генератор решения -&gt; Тестировщик дефектов -&gt; Оптимизатор -&gt; Независимая Модель-Судья (Judge). Судья выставляет объективный скоринг (0-10) и при непрохождении порога возвращает задачу на доработку с замечаниями. Полностью детерминированный цикл рефлексии (Reflexion), гарантирующий исключение галлюцинаций до публикации артефактов.</w:t>
-        <w:br/>
-      </w:r>
-      <w:r>
-        <w:rPr>
-          <w:b/>
-        </w:rPr>
-        <w:t xml:space="preserve">Результат и артефакты: </w:t>
-      </w:r>
-      <w:r>
-        <w:t>Действующий модуль agent_evaluator_optimizer.py, 100% покрытие автотестами, детерминированная критериальная матрица.</w:t>
-      </w:r>
-    </w:p>
-    <w:p>
-      <w:pPr>
-        <w:spacing w:before="100" w:after="20"/>
-      </w:pPr>
-      <w:r>
-        <w:rPr>
-          <w:b/>
-          <w:color w:val="004C87"/>
-          <w:sz w:val="19"/>
-        </w:rPr>
-        <w:t>• OilGas FastMCP Server: Высокопроизводительный сервер контекста по нормативной базе ТЭК</w:t>
-      </w:r>
-    </w:p>
-    <w:p>
-      <w:pPr>
-        <w:spacing w:after="40" w:line="269" w:lineRule="auto"/>
-        <w:ind w:left="259"/>
-      </w:pPr>
-      <w:r>
-        <w:rPr>
-          <w:b/>
-        </w:rPr>
-        <w:t xml:space="preserve">Роль: </w:t>
-      </w:r>
-      <w:r>
-        <w:t>Architect / Developer (в партнерстве со специалистами по инфраструктуре ИИ)</w:t>
-        <w:br/>
-      </w:r>
-      <w:r>
-        <w:rPr>
-          <w:b/>
-        </w:rPr>
-        <w:t xml:space="preserve">Стек: </w:t>
-      </w:r>
-      <w:r>
-        <w:t>Python 3.13, FastMCP (Anthropic Model Context Protocol), Qdrant Vector DB, Sentence-Transformers.</w:t>
-        <w:br/>
-      </w:r>
-      <w:r>
-        <w:t>Суть решения: Разработка сервера контекста новейшего стандарта Anthropic MCP для интеграции LLM-агентов с нормативной базой (ГОСТ Р 53711, СТО, ФНП № 534). Позволяет любому внешнему агенту через stdio и стандартизированный JSON-RPC безопасно извлекать точные нормативные требования с миллисекундным откликом.</w:t>
-        <w:br/>
-      </w:r>
-      <w:r>
-        <w:rPr>
-          <w:b/>
-        </w:rPr>
-        <w:t xml:space="preserve">Результат и артефакты: </w:t>
-      </w:r>
-      <w:r>
-        <w:t>Действующий MCP-сервер с инструментами семантического поиска и верификации стандартов. Тестовый скрипт test_oilgas_mcp.py.</w:t>
-      </w:r>
-    </w:p>
-    <w:p>
-      <w:pPr>
-        <w:spacing w:before="200" w:after="60"/>
-      </w:pPr>
-      <w:r>
-        <w:rPr>
-          <w:b/>
-          <w:color w:val="003366"/>
-          <w:sz w:val="23"/>
-        </w:rPr>
-        <w:t>3. Industrial AI, промышленная телеметрия и MLOps (ТЭК и Тяжелая индустрия)</w:t>
-      </w:r>
-    </w:p>
-    <w:p>
-      <w:pPr>
-        <w:spacing w:before="100" w:after="20"/>
-      </w:pPr>
-      <w:r>
-        <w:rPr>
-          <w:b/>
-          <w:color w:val="004C87"/>
-          <w:sz w:val="19"/>
-        </w:rPr>
-        <w:t>• Цифровая трансформация ТОиР и контур раннего предупреждения (Восточная горнорудная компания)</w:t>
-      </w:r>
-    </w:p>
-    <w:p>
-      <w:pPr>
-        <w:spacing w:after="40" w:line="269" w:lineRule="auto"/>
-        <w:ind w:left="259"/>
-      </w:pPr>
-      <w:r>
-        <w:rPr>
-          <w:b/>
-        </w:rPr>
-        <w:t xml:space="preserve">Роль: </w:t>
-      </w:r>
-      <w:r>
-        <w:t>Руководитель проектов цифровой трансформации (производственное внедрение)</w:t>
+        <w:t>Руководитель проектов цифровой трансформации (личное внедрение в производство)</w:t>
         <w:br/>
       </w:r>
       <w:r>
@@ -588,7 +484,7 @@
         <w:t xml:space="preserve">Результат и артефакты: </w:t>
       </w:r>
       <w:r>
-        <w:t>Действующий производственный контур, сокращение времени регистрации инцидентов ТОиР, система предиктивного мониторинга отказов техники.</w:t>
+        <w:t>Действующий производственный контур, сокращение времени регистрации инцидентов ТОиР, предиктивный мониторинг отказов техники.</w:t>
       </w:r>
     </w:p>
     <w:p>
@@ -601,7 +497,7 @@
           <w:color w:val="004C87"/>
           <w:sz w:val="19"/>
         </w:rPr>
-        <w:t>• DrillSense: Предиктивное прогнозирование механической скорости бурения ROP (Нефтегаз)</w:t>
+        <w:t>• 3. DrillSense: Предиктивное прогнозирование механической скорости бурения ROP (Нефтегаз)</w:t>
       </w:r>
     </w:p>
     <w:p>
@@ -630,7 +526,7 @@
         <w:br/>
       </w:r>
       <w:r>
-        <w:t>Суть решения: Прогнозирование скорости проходки ROP в реальном времени по 5 датчикам забойной телеметрии (нагрузка на долото WOB, обороты ротора RPM, подача насосов Flow Rate, крутящий момент Torque). Автоматическое выявление аномальных технологических режимов и предупреждение рисков прихвата бурового инструмента.</w:t>
+        <w:t>Суть решения: Прогнозирование скорости проходки ROP в реальном времени по 5 датчикам забойной телеметрии (нагрузка на долото WOB, обороты ротора RPM, подача насосов Flow Rate, крутящий момент Torque). Автоматическое определение аномальных режимов бурения и предупреждение рисков прихвата бурового инструмента.</w:t>
         <w:br/>
       </w:r>
       <w:r>
@@ -653,7 +549,7 @@
           <w:color w:val="004C87"/>
           <w:sz w:val="19"/>
         </w:rPr>
-        <w:t>• PumpGuard: IoT MLOps конвейер предиктивного скоринга отказов погружных насосов УЭЦН</w:t>
+        <w:t>• 4. PumpGuard: IoT MLOps конвейер предиктивного скоринга отказов погружных насосов УЭЦН</w:t>
       </w:r>
     </w:p>
     <w:p>
@@ -692,7 +588,267 @@
         <w:t xml:space="preserve">Результат и артефакты: </w:t>
       </w:r>
       <w:r>
-        <w:t>Обработка потока до 5 000 замеров/сек, предотвращение аварийного подземного ремонта скважин (ПРС). Модуль quick_score_demo.py.</w:t>
+        <w:t>Обработка потока до 5 000 замеров/сек, предотвращение дорогостоящего подземного ремонта скважин (ПРС). Модуль quick_score_demo.py.</w:t>
+      </w:r>
+    </w:p>
+    <w:p>
+      <w:pPr>
+        <w:spacing w:before="100" w:after="20"/>
+      </w:pPr>
+      <w:r>
+        <w:rPr>
+          <w:b/>
+          <w:color w:val="004C87"/>
+          <w:sz w:val="19"/>
+        </w:rPr>
+        <w:t>• 5. CoreVision: Сегментация микрошлифов керна и петрофизический анализ пористости</w:t>
+      </w:r>
+    </w:p>
+    <w:p>
+      <w:pPr>
+        <w:spacing w:after="40" w:line="269" w:lineRule="auto"/>
+        <w:ind w:left="259"/>
+      </w:pPr>
+      <w:r>
+        <w:rPr>
+          <w:b/>
+        </w:rPr>
+        <w:t xml:space="preserve">Роль: </w:t>
+      </w:r>
+      <w:r>
+        <w:t>Product Owner / System Architect (в партнерстве со специалистами по компьютерному зрению)</w:t>
+        <w:br/>
+      </w:r>
+      <w:r>
+        <w:rPr>
+          <w:b/>
+        </w:rPr>
+        <w:t xml:space="preserve">Стек: </w:t>
+      </w:r>
+      <w:r>
+        <w:t>Python, OpenCV, U-Net / ResNet architecture, FastAPI, геолого-петрографические данные USGS.</w:t>
+        <w:br/>
+      </w:r>
+      <w:r>
+        <w:t>Суть решения: Автоматический микроструктурный анализ шлифов керна: сегментация порового пространства, разделение открытой и закрытой пористости, детекция микротрещин. Ускорение петрофизического описания керна геологом с 90 минут до 2 секунд.</w:t>
+        <w:br/>
+      </w:r>
+      <w:r>
+        <w:rPr>
+          <w:b/>
+        </w:rPr>
+        <w:t xml:space="preserve">Результат и артефакты: </w:t>
+      </w:r>
+      <w:r>
+        <w:t>Интерактивный API-сервис, расчет эффективной пористости с погрешностью менее 3.8%. Модуль quick_segment_demo.py.</w:t>
+      </w:r>
+    </w:p>
+    <w:p>
+      <w:pPr>
+        <w:spacing w:before="100" w:after="20"/>
+      </w:pPr>
+      <w:r>
+        <w:rPr>
+          <w:b/>
+          <w:color w:val="004C87"/>
+          <w:sz w:val="19"/>
+        </w:rPr>
+        <w:t>• 6. SafeTrack: Видеоаналитика опасных зон и контроль СИЗ на буровой площадке (HSE)</w:t>
+      </w:r>
+    </w:p>
+    <w:p>
+      <w:pPr>
+        <w:spacing w:after="40" w:line="269" w:lineRule="auto"/>
+        <w:ind w:left="259"/>
+      </w:pPr>
+      <w:r>
+        <w:rPr>
+          <w:b/>
+        </w:rPr>
+        <w:t xml:space="preserve">Роль: </w:t>
+      </w:r>
+      <w:r>
+        <w:t>System Engineer / PM (в партнерстве с инженерами компьютерного зрения)</w:t>
+        <w:br/>
+      </w:r>
+      <w:r>
+        <w:rPr>
+          <w:b/>
+        </w:rPr>
+        <w:t xml:space="preserve">Стек: </w:t>
+      </w:r>
+      <w:r>
+        <w:t>Python, YOLOv8, ByteTrack, полигональные алгоритмы геозон (Roboflow PPE Dataset).</w:t>
+        <w:br/>
+      </w:r>
+      <w:r>
+        <w:t>Суть решения: Контроль соблюдения правил охраны труда и промбезопасности: отслеживание нахождения персонала в опасной зоне движения ключей/элеватора и контроль обязательного ношения касок и сигнальных жилетов. Генерация тревожных событий для супервайзера буровой.</w:t>
+        <w:br/>
+      </w:r>
+      <w:r>
+        <w:rPr>
+          <w:b/>
+        </w:rPr>
+        <w:t xml:space="preserve">Результат и артефакты: </w:t>
+      </w:r>
+      <w:r>
+        <w:t>Работа в реальном времени (25-30 FPS на CPU без дорогих видеокарт), мгновенная отправка алертов. Модуль quick_safetrack_demo.py.</w:t>
+      </w:r>
+    </w:p>
+    <w:p>
+      <w:pPr>
+        <w:spacing w:before="100" w:after="20"/>
+      </w:pPr>
+      <w:r>
+        <w:rPr>
+          <w:b/>
+          <w:color w:val="004C87"/>
+          <w:sz w:val="19"/>
+        </w:rPr>
+        <w:t>• 7. OilGas FastMCP Server: Семантический контекстный поиск по стандартам ТЭК (ГОСТ, СТО)</w:t>
+      </w:r>
+    </w:p>
+    <w:p>
+      <w:pPr>
+        <w:spacing w:after="40" w:line="269" w:lineRule="auto"/>
+        <w:ind w:left="259"/>
+      </w:pPr>
+      <w:r>
+        <w:rPr>
+          <w:b/>
+        </w:rPr>
+        <w:t xml:space="preserve">Роль: </w:t>
+      </w:r>
+      <w:r>
+        <w:t>Architect / Developer (в партнерстве со специалистами по инфраструктуре ИИ)</w:t>
+        <w:br/>
+      </w:r>
+      <w:r>
+        <w:rPr>
+          <w:b/>
+        </w:rPr>
+        <w:t xml:space="preserve">Стек: </w:t>
+      </w:r>
+      <w:r>
+        <w:t>Python 3.13, FastMCP (Anthropic Model Context Protocol), Qdrant Vector DB, Sentence-Transformers.</w:t>
+        <w:br/>
+      </w:r>
+      <w:r>
+        <w:t>Суть решения: Разработка сервера контекста новейшего стандарта Anthropic MCP для интеграции LLM-агентов с нормативной базой ТЭК (ГОСТ Р 53711, СТО, ФНП № 534 по ГНВП). Позволяет любому агенту через stdio и JSON-RPC извлекать точные нормативные требования.</w:t>
+        <w:br/>
+      </w:r>
+      <w:r>
+        <w:rPr>
+          <w:b/>
+        </w:rPr>
+        <w:t xml:space="preserve">Результат и артефакты: </w:t>
+      </w:r>
+      <w:r>
+        <w:t>Действующий MCP-сервер с инструментами семантического поиска и верификации стандартов. Тест test_oilgas_mcp.py.</w:t>
+      </w:r>
+    </w:p>
+    <w:p>
+      <w:pPr>
+        <w:spacing w:before="100" w:after="20"/>
+      </w:pPr>
+      <w:r>
+        <w:rPr>
+          <w:b/>
+          <w:color w:val="004C87"/>
+          <w:sz w:val="19"/>
+        </w:rPr>
+        <w:t>• 8. RAG-бот по регламентам ликвидации аварий и ГНВП в бурении (Zero-Hallucination)</w:t>
+      </w:r>
+    </w:p>
+    <w:p>
+      <w:pPr>
+        <w:spacing w:after="40" w:line="269" w:lineRule="auto"/>
+        <w:ind w:left="259"/>
+      </w:pPr>
+      <w:r>
+        <w:rPr>
+          <w:b/>
+        </w:rPr>
+        <w:t xml:space="preserve">Роль: </w:t>
+      </w:r>
+      <w:r>
+        <w:t>Prompt Engineer / System Architect (в партнерстве со специалистами отрасли)</w:t>
+        <w:br/>
+      </w:r>
+      <w:r>
+        <w:rPr>
+          <w:b/>
+        </w:rPr>
+        <w:t xml:space="preserve">Стек: </w:t>
+      </w:r>
+      <w:r>
+        <w:t>Python, LangChain, BM25 + Dense RAG, строгие промпты отсечения галлюцинаций.</w:t>
+        <w:br/>
+      </w:r>
+      <w:r>
+        <w:t>Суть решения: Специализированный ассистент бурового супервайзера по регламентам герметизации устья и ликвидации газонефтеводопроявлений. Модель цитирует пункты правил безопасности Ростехнадзора со ссылкой на номер страницы и честно отказывает в ответе, если данных нет.</w:t>
+        <w:br/>
+      </w:r>
+      <w:r>
+        <w:rPr>
+          <w:b/>
+        </w:rPr>
+        <w:t xml:space="preserve">Результат и артефакты: </w:t>
+      </w:r>
+      <w:r>
+        <w:t>100% точность цитирования нормативных пунктов, нулевой уровень галлюцинаций. Модуль test_rag_offline.py.</w:t>
+      </w:r>
+    </w:p>
+    <w:p>
+      <w:pPr>
+        <w:spacing w:before="100" w:after="20"/>
+      </w:pPr>
+      <w:r>
+        <w:rPr>
+          <w:b/>
+          <w:color w:val="004C87"/>
+          <w:sz w:val="19"/>
+        </w:rPr>
+        <w:t>• 9. Дайджест рынка нефти Brent: Сценарное прогнозирование и технический анализ</w:t>
+      </w:r>
+    </w:p>
+    <w:p>
+      <w:pPr>
+        <w:spacing w:after="40" w:line="269" w:lineRule="auto"/>
+        <w:ind w:left="259"/>
+      </w:pPr>
+      <w:r>
+        <w:rPr>
+          <w:b/>
+        </w:rPr>
+        <w:t xml:space="preserve">Роль: </w:t>
+      </w:r>
+      <w:r>
+        <w:t>Co-Developer / Quantitative Analyst</w:t>
+        <w:br/>
+      </w:r>
+      <w:r>
+        <w:rPr>
+          <w:b/>
+        </w:rPr>
+        <w:t xml:space="preserve">Стек: </w:t>
+      </w:r>
+      <w:r>
+        <w:t>Python, биржевые API ICE/Yahoo, RSS-парсеры, скользящие средние SMA-7/30, Matplotlib.</w:t>
+        <w:br/>
+      </w:r>
+      <w:r>
+        <w:t>Суть решения: Автоматический сбор биржевых котировок сорта Brent, расчет исторической волатильности, генерация свечных графиков и сценарное моделирование коридора цен (базовый, стресс, оптимистичный) для подготовки аналитических записок.</w:t>
+        <w:br/>
+      </w:r>
+      <w:r>
+        <w:rPr>
+          <w:b/>
+        </w:rPr>
+        <w:t xml:space="preserve">Результат и артефакты: </w:t>
+      </w:r>
+      <w:r>
+        <w:t>Автономный скрипт run_market_analytics.py, генерация графиков трендов и сводки для аналитиков.</w:t>
       </w:r>
     </w:p>
     <w:p>
@@ -705,7 +861,7 @@
           <w:color w:val="003366"/>
           <w:sz w:val="23"/>
         </w:rPr>
-        <w:t>4. FinTech, LegalTech и системы принятия решений (Decision Engines)</w:t>
+        <w:t>4. Мультиагентные контуры, аудит рисков и прикладные сервисы</w:t>
       </w:r>
     </w:p>
     <w:p>
@@ -718,7 +874,59 @@
           <w:color w:val="004C87"/>
           <w:sz w:val="19"/>
         </w:rPr>
-        <w:t>• Экспресс-аудит коммерческих договоров B2B и скоринг юридических рисков</w:t>
+        <w:t>• 10. Multi-Agent Judge: Контур самокритики и арбитража решений (Evaluator-Optimizer)</w:t>
+      </w:r>
+    </w:p>
+    <w:p>
+      <w:pPr>
+        <w:spacing w:after="40" w:line="269" w:lineRule="auto"/>
+        <w:ind w:left="259"/>
+      </w:pPr>
+      <w:r>
+        <w:rPr>
+          <w:b/>
+        </w:rPr>
+        <w:t xml:space="preserve">Роль: </w:t>
+      </w:r>
+      <w:r>
+        <w:t>AI Solutions Architect (в партнерстве со специалистами по LLM)</w:t>
+        <w:br/>
+      </w:r>
+      <w:r>
+        <w:rPr>
+          <w:b/>
+        </w:rPr>
+        <w:t xml:space="preserve">Стек: </w:t>
+      </w:r>
+      <w:r>
+        <w:t>Python, Multi-Agent Architecture, паттерн Anthropic Building Effective Agents, LLM-as-a-Judge, Ragas.</w:t>
+        <w:br/>
+      </w:r>
+      <w:r>
+        <w:t>Суть решения: Архитектурный контур из 4-х агентов: Генератор кода -&gt; Тестировщик дефектов -&gt; Оптимизатор -&gt; Независимая Модель-Судья (Judge). Судья выставляет объективный скоринг (0-10) и при непрохождении порога возвращает задачу на доработку с замечаниями.</w:t>
+        <w:br/>
+      </w:r>
+      <w:r>
+        <w:rPr>
+          <w:b/>
+        </w:rPr>
+        <w:t xml:space="preserve">Результат и артефакты: </w:t>
+      </w:r>
+      <w:r>
+        <w:t>Полностью детерминированный цикл рефлексии (Reflexion), исключающий выпуск непроверенных гипотез. Модуль agent_evaluator_optimizer.py.</w:t>
+      </w:r>
+    </w:p>
+    <w:p>
+      <w:pPr>
+        <w:spacing w:before="100" w:after="20"/>
+      </w:pPr>
+      <w:r>
+        <w:rPr>
+          <w:b/>
+          <w:color w:val="004C87"/>
+          <w:sz w:val="19"/>
+        </w:rPr>
+        <w:t>• 11. Экспресс-аудит коммерческих договоров B2B и скоринг юридических рисков</w:t>
       </w:r>
     </w:p>
     <w:p>
@@ -743,11 +951,11 @@
         <w:t xml:space="preserve">Стек: </w:t>
       </w:r>
       <w:r>
-        <w:t>Python 3.9+, Pydantic v2, Decision Engine, стоп-факторы Red Flags, автогенерация протоколов.</w:t>
+        <w:t>Python 3.9+, Pydantic v2, Decision Engine, фильтрация стоп-факторов Red Flags.</w:t>
         <w:br/>
       </w:r>
       <w:r>
-        <w:t>Суть решения: Автоматический аудит коммерческих договоров поставки и подряда: детекция кабальных условий (отсрочка платежа &gt;90 дней, односторонняя пеня &gt;0.1%/день, отсутствие форс-мажора), расчет скоринга надежности контракта (0-100) и автоматическая генерация официального протокола разногласий.</w:t>
+        <w:t>Суть решения: Автоматический аудит договоров поставки и подряда: детекция кабальных условий (отсрочка платежа &gt;90 дней, односторонняя пеня &gt;0.1%/день, отсутствие форс-мажора), расчет скоринга надежности (0-100) и автоматическая генерация официального протокола разногласий.</w:t>
         <w:br/>
       </w:r>
       <w:r>
@@ -757,7 +965,7 @@
         <w:t xml:space="preserve">Результат и артефакты: </w:t>
       </w:r>
       <w:r>
-        <w:t>Работающий скрипт run.py, структурированный отчет audit.json, готовый юридический протокол protocol_of_disagreements.md.</w:t>
+        <w:t>Работающий скрипт run.py, машиночитаемый audit.json, готовый protocol_of_disagreements.md.</w:t>
       </w:r>
     </w:p>
     <w:p>
@@ -770,7 +978,7 @@
           <w:color w:val="004C87"/>
           <w:sz w:val="19"/>
         </w:rPr>
-        <w:t>• Telecom Churn Prediction: Прогнозирование оттока клиентов телеком-оператора</w:t>
+        <w:t>• 12. Умный мониторинг рынка и цен конкурентов (E-commerce Retail Analytics)</w:t>
       </w:r>
     </w:p>
     <w:p>
@@ -785,7 +993,7 @@
         <w:t xml:space="preserve">Роль: </w:t>
       </w:r>
       <w:r>
-        <w:t>Data Analyst / ML-инженер</w:t>
+        <w:t>Автор решения / Developer</w:t>
         <w:br/>
       </w:r>
       <w:r>
@@ -795,11 +1003,11 @@
         <w:t xml:space="preserve">Стек: </w:t>
       </w:r>
       <w:r>
-        <w:t>Python, Pandas, Scikit-learn, XGBoost, Matplotlib, Jupyter Notebook (7 043 клиента, 21 признак).</w:t>
+        <w:t>Python 3.9+, Pydantic v2, потоковая валидация, HTML5/CSS3 дашборды.</w:t>
         <w:br/>
       </w:r>
       <w:r>
-        <w:t>Суть решения: Разведочный анализ данных (EDA), выявление ключевых факторов оттока, балансировка выборки, сравнительное обучение 3-х моделей (Logistic Regression, Random Forest, XGBoost) и разработка прикладных рекомендаций для CRM по удержанию клиентской базы.</w:t>
+        <w:t>Суть решения: Автоматический мониторинг ценообразования и остатков: детекция демпинга (&gt;20%), дефицита на складах конкурентов и всплесков брака. Формирование управленческих рекомендаций для коммерческого директора.</w:t>
         <w:br/>
       </w:r>
       <w:r>
@@ -809,7 +1017,7 @@
         <w:t xml:space="preserve">Результат и артефакты: </w:t>
       </w:r>
       <w:r>
-        <w:t>Лучшая модель с метриками AUC-ROC = 0.8425, Accuracy = 0.8034. Топ-факторы риска: тип контракта month-to-month, tenure, MonthlyCharges.</w:t>
+        <w:t>Интерактивный адаптивный дашборд competitor_dashboard.html, журнал сигналов competitor_analysis.json.</w:t>
       </w:r>
     </w:p>
     <w:p>
@@ -822,7 +1030,7 @@
           <w:color w:val="004C87"/>
           <w:sz w:val="19"/>
         </w:rPr>
-        <w:t>• Bank Marketing Campaign Analytics: Аналитический дашборд в Yandex DataLens</w:t>
+        <w:t>• 13. DetailLab: Автоматизированный генератор отраслевого контента на базе LLM</w:t>
       </w:r>
     </w:p>
     <w:p>
@@ -837,7 +1045,7 @@
         <w:t xml:space="preserve">Роль: </w:t>
       </w:r>
       <w:r>
-        <w:t>Бизнес-аналитик / Data Analyst</w:t>
+        <w:t>Product Manager / Prompt Engineer</w:t>
         <w:br/>
       </w:r>
       <w:r>
@@ -847,11 +1055,11 @@
         <w:t xml:space="preserve">Стек: </w:t>
       </w:r>
       <w:r>
-        <w:t>Yandex DataLens, SQL, Excel, датасет UCI Bank Marketing (41 188 записей).</w:t>
+        <w:t>Claude API, ChatGPT, Telegram Bot API, библиотека специализированных промптов, Google Sheets.</w:t>
         <w:br/>
       </w:r>
       <w:r>
-        <w:t>Суть решения: Анализ конверсии маркетинговых кампаний банка по привлечению депозитов: расчет 3 KPI, построение 5 интерактивных визуализаций, сегментация клиентов и выявление ключевых паттернов (звонки длительностью 5+ минут обеспечивают трехкратный рост конверсии).</w:t>
+        <w:t>Суть решения: Разработка Telegram-бота для владельцев сервисных центров: автоматическая генерация постов и описаний услуг с сохранением Tone of Voice. Проведение CustDev (интервью с 50+ предпринимателями), расчет юнит-экономики (LTV/CAC, монетизация по подписке).</w:t>
         <w:br/>
       </w:r>
       <w:r>
@@ -861,7 +1069,59 @@
         <w:t xml:space="preserve">Результат и артефакты: </w:t>
       </w:r>
       <w:r>
-        <w:t>Интерактивный BI-дашборд с кросс-фильтрацией, прикладные рекомендации по оптимизации сезонных маркетинговых бюджетов.</w:t>
+        <w:t>Рабочий прототип бота, 78% контента принимается без ручных правок, сокращение времени подготовки поста с 45 минут до 30 секунд. Модуль run_detaillab_engine.py.</w:t>
+      </w:r>
+    </w:p>
+    <w:p>
+      <w:pPr>
+        <w:spacing w:before="100" w:after="20"/>
+      </w:pPr>
+      <w:r>
+        <w:rPr>
+          <w:b/>
+          <w:color w:val="004C87"/>
+          <w:sz w:val="19"/>
+        </w:rPr>
+        <w:t>• 14. Health Assistant: Персональный диалоговый ассистент на базе LLM</w:t>
+      </w:r>
+    </w:p>
+    <w:p>
+      <w:pPr>
+        <w:spacing w:after="40" w:line="269" w:lineRule="auto"/>
+        <w:ind w:left="259"/>
+      </w:pPr>
+      <w:r>
+        <w:rPr>
+          <w:b/>
+        </w:rPr>
+        <w:t xml:space="preserve">Роль: </w:t>
+      </w:r>
+      <w:r>
+        <w:t>Product Owner / Системный аналитик</w:t>
+        <w:br/>
+      </w:r>
+      <w:r>
+        <w:rPr>
+          <w:b/>
+        </w:rPr>
+        <w:t xml:space="preserve">Стек: </w:t>
+      </w:r>
+      <w:r>
+        <w:t>OpenAI API, Replit, Prompt Engineering, веб-интерфейс, этические дисклеймеры.</w:t>
+        <w:br/>
+      </w:r>
+      <w:r>
+        <w:t>Суть решения: Проектирование диалогового сервиса рекомендаций по ЗОЖ и приему лекарств. Разработка сценариев диалога, потоков данных и системной защиты от небезопасных медицинских рекомендаций (Guardrails).</w:t>
+        <w:br/>
+      </w:r>
+      <w:r>
+        <w:rPr>
+          <w:b/>
+        </w:rPr>
+        <w:t xml:space="preserve">Результат и артефакты: </w:t>
+      </w:r>
+      <w:r>
+        <w:t>Действующий веб-прототип, сценарии диалогов (/start, /profile), лог-модуль run_health_assistant.py.</w:t>
       </w:r>
     </w:p>
     <w:p>
@@ -874,7 +1134,7 @@
           <w:color w:val="003366"/>
           <w:sz w:val="23"/>
         </w:rPr>
-        <w:t>5. Продуктовые сервисы, Ритейл и E-commerce Аналитика</w:t>
+        <w:t>5. Продуктовая аналитика и классический Machine Learning</w:t>
       </w:r>
     </w:p>
     <w:p>
@@ -887,7 +1147,7 @@
           <w:color w:val="004C87"/>
           <w:sz w:val="19"/>
         </w:rPr>
-        <w:t>• StockFlow: ИИ-агент прогнозирования спроса и рекомендаций по закупкам в ритейле</w:t>
+        <w:t>• 15. StockFlow: ИИ-агент прогнозирования спроса и рекомендаций по закупкам в ритейле</w:t>
       </w:r>
     </w:p>
     <w:p>
@@ -916,7 +1176,7 @@
         <w:br/>
       </w:r>
       <w:r>
-        <w:t>Суть решения: Проектирование архитектуры ИИ-агента для прогнозирования потребительского спроса на 14 дней вперед для розничной сети: формализация бизнес-процессов в BPMN, проектирование User Flow веб-интерфейса, постановка ТЗ для ML-модели и ETL-контуров, реестр рисков качества данных и координация спринтов команды.</w:t>
+        <w:t>Суть решения: Проектирование архитектуры ИИ-агента для прогноза спроса на 14 дней вперед для розничной сети: описание процессов в BPMN, User Flow веб-интерфейса, ТЗ для ML-модели и ETL, реестр рисков качества данных и координация спринтов команды.</w:t>
         <w:br/>
       </w:r>
       <w:r>
@@ -926,7 +1186,7 @@
         <w:t xml:space="preserve">Результат и артефакты: </w:t>
       </w:r>
       <w:r>
-        <w:t>Прототип с точностью ~75% на исторических данных, полный комплект проектных спецификаций, целевое снижение дефицита полок на 15%.</w:t>
+        <w:t>Прототип с точностью ~75% на тестовых данных, полная проектная документация, целевое снижение дефицита полок на 15%. Модуль run_stockflow_forecast.py.</w:t>
       </w:r>
     </w:p>
     <w:p>
@@ -939,7 +1199,7 @@
           <w:color w:val="004C87"/>
           <w:sz w:val="19"/>
         </w:rPr>
-        <w:t>• Умный мониторинг рынка и цен конкурентов (E-commerce Retail Analytics)</w:t>
+        <w:t>• 16. Telecom Churn Prediction: Модель прогнозирования оттока клиентов телеком-оператора</w:t>
       </w:r>
     </w:p>
     <w:p>
@@ -954,7 +1214,7 @@
         <w:t xml:space="preserve">Роль: </w:t>
       </w:r>
       <w:r>
-        <w:t>Автор решения / Developer</w:t>
+        <w:t>Аналитик данных / ML-инженер</w:t>
         <w:br/>
       </w:r>
       <w:r>
@@ -964,11 +1224,11 @@
         <w:t xml:space="preserve">Стек: </w:t>
       </w:r>
       <w:r>
-        <w:t>Python 3.9+, Pydantic v2, потоковая валидация данных, HTML5/CSS3 дашборды.</w:t>
+        <w:t>Python, Pandas, Scikit-learn, XGBoost, Matplotlib, Jupyter Notebook (7 043 клиента, 21 признак).</w:t>
         <w:br/>
       </w:r>
       <w:r>
-        <w:t>Суть решения: Автоматический мониторинг ценообразования и складских остатков: детекция недобросовестного демпинга (&gt;20%), дефицита на складах конкурентов и всплесков рекламаций. Автоматическое формирование сводки управленческих рекомендаций для коммерческого директора.</w:t>
+        <w:t>Суть решения: Разведочный анализ данных (EDA), выявление факторов оттока, устранение дисбаланса классов, обучение и сравнение 3 моделей (Logistic Regression, Random Forest, XGBoost) и выработка рекомендаций для CRM по удержанию клиентов.</w:t>
         <w:br/>
       </w:r>
       <w:r>
@@ -978,7 +1238,7 @@
         <w:t xml:space="preserve">Результат и артефакты: </w:t>
       </w:r>
       <w:r>
-        <w:t>Интерактивный адаптивный дашборд competitor_dashboard.html, машиночитаемый журнал сигналов competitor_analysis.json.</w:t>
+        <w:t>Лучшая модель с AUC-ROC = 0.8425, Accuracy = 0.8034. Топ-факторы: тип контракта month-to-month, tenure, MonthlyCharges. Модуль run_churn_model.py.</w:t>
       </w:r>
     </w:p>
     <w:p>
@@ -991,7 +1251,7 @@
           <w:color w:val="004C87"/>
           <w:sz w:val="19"/>
         </w:rPr>
-        <w:t>• DetailLab: Автоматизированный генератор отраслевого контента на базе LLM</w:t>
+        <w:t>• 17. Bank Marketing Campaign Analytics: Аналитический дашборд в Yandex DataLens</w:t>
       </w:r>
     </w:p>
     <w:p>
@@ -1006,7 +1266,7 @@
         <w:t xml:space="preserve">Роль: </w:t>
       </w:r>
       <w:r>
-        <w:t>Product Manager / Prompt Engineer</w:t>
+        <w:t>Бизнес-аналитик / Data Analyst</w:t>
         <w:br/>
       </w:r>
       <w:r>
@@ -1016,11 +1276,11 @@
         <w:t xml:space="preserve">Стек: </w:t>
       </w:r>
       <w:r>
-        <w:t>Claude API, ChatGPT, Telegram Bot API, библиотека специализированных промптов, Google Sheets.</w:t>
+        <w:t>Yandex DataLens, SQL, Excel, UCI Bank Marketing (41 188 записей).</w:t>
         <w:br/>
       </w:r>
       <w:r>
-        <w:t>Суть решения: Разработка Telegram-бота для владельцев детейлинг-центров: автоматическая генерация постов и описаний услуг с сохранением Tone of Voice. Проведение CustDev (интервью с 50+ предпринимателями), расчет юнит-экономики (LTV/CAC, модель монетизации по подписке).</w:t>
+        <w:t>Суть решения: Анализ эффективности маркетинговых кампаний банка по привлечению депозитов: расчет 3 KPI, построение 5 визуализаций, фильтрация сегментов, выявление пиков эффективности звонков (длительность 5+ минут дает в 3 раза выше конверсию).</w:t>
         <w:br/>
       </w:r>
       <w:r>
@@ -1030,7 +1290,7 @@
         <w:t xml:space="preserve">Результат и артефакты: </w:t>
       </w:r>
       <w:r>
-        <w:t>Рабочий прототип бота, 78% контента принимается заказчиками без ручных правок, сокращение времени подготовки поста с 45 мин до 30 сек.</w:t>
+        <w:t>Интерактивный дашборд с кросс-фильтрацией, прикладные рекомендации по сезонному бюджетированию. Модуль run_bank_marketing_analysis.py.</w:t>
       </w:r>
     </w:p>
     <w:p>
@@ -1071,7 +1331,7 @@
         <w:t xml:space="preserve">Роль: Проджект-менеджер, организатор. </w:t>
       </w:r>
       <w:r>
-        <w:t>Организация мероприятий крупного масштаба с привлечением более 10 субподрядчиков (звук/свет, безопасность, кейтеринг). 100% соблюдение сметы, полные аншлаги, эффективный кризис-менеджмент.</w:t>
+        <w:t>Организация мероприятий крупного масштаба с привлечением более 10 субподрядчиков (звук/свет, безопасность, кейтеринг). 100% соблюдение сметы, полные аншлаги, успешный кризис-менеджмент.</w:t>
       </w:r>
     </w:p>
     <w:p>
@@ -1127,7 +1387,7 @@
         <w:t xml:space="preserve">Роль: Инициатор, операционный директор. </w:t>
       </w:r>
       <w:r>
-        <w:t>CustDev-исследование ниши, аудит фабрик, брендинг, логистика и контроль маржинальности. Успешный запуск и выход на плановую окупаемость.</w:t>
+        <w:t>CustDev-исследование ниши, аудит фабрик, брендинг, логистика и контроль маржинальности. Успешный запуск и выход на стабильные продажи (+300%).</w:t>
       </w:r>
     </w:p>
     <w:p>
@@ -1155,7 +1415,7 @@
         <w:t xml:space="preserve">Роль: Инициатор и проджект-менеджер. </w:t>
       </w:r>
       <w:r>
-        <w:t>Любительский турнир (12 команд, 200+ участников, зрители, судейская коллегия). Соблюдение сметы и сроков на 100%, получение плановой прибыли.</w:t>
+        <w:t>Любительский турнир (12 команд, 200+ участников, зрители, судьи). Соблюдение сметы и сроков на 100%, плановая прибыль.</w:t>
       </w:r>
     </w:p>
     <w:p>
@@ -1221,7 +1481,7 @@
     </w:p>
     <w:sectPr>
       <w:pgSz w:w="12240" w:h="15840"/>
-      <w:pgMar w:top="864" w:right="1008" w:bottom="864" w:left="1008" w:header="720" w:footer="720" w:gutter="0"/>
+      <w:pgMar w:top="792" w:right="936" w:bottom="792" w:left="936" w:header="720" w:footer="720" w:gutter="0"/>
       <w:cols w:space="720"/>
       <w:docGrid w:linePitch="360"/>
     </w:sectPr>

</xml_diff>